<commit_message>
Release 1.1.0: SRS v1.6 traceability, search keyboard navigation and highlighting, template version on forms, guides and coverage checklist updated
- Traceability now covers 480 requirements (v1.3 + 159 added by v1.4-1.6), each with an assessed status (Met, Partial, Not met) and evidence
- Global search: arrow keys, Enter, matched words highlighted, immediate focus; internal refs no longer shown as codes
- User Guide parts 10-14 (questionnaires and channels, e-mail and WhatsApp, training plan, generated documents, search); Installation Guide 9.1 (SMTP, WhatsApp, PUBLIC_URL, CHANNEL_SECRET_KEY)
- Coverage checklist: change request 1.1 and IF-PAC / training engineering report sheets

Co-Authored-By: Claude Opus 5.5 <noreply@anthropic.com>
Claude-Session: https://claude.ai/code/session_01CPoP9gXznxAoCuDQx1kksH
</commit_message>
<xml_diff>
--- a/cortexskills/deliverables/CortexSkills_Installation_Guide.docx
+++ b/cortexskills/deliverables/CortexSkills_Installation_Guide.docx
@@ -190,7 +190,7 @@
           <w:sz w:val="20"/>
           <w:szCs w:val="20"/>
         </w:rPr>
-        <w:t>Version 1.0.0 · 2026-09-29</w:t>
+        <w:t>Version 1.1.0 · 2026-10-05</w:t>
       </w:r>
     </w:p>
     <w:p>
@@ -275,7 +275,7 @@
             </w:rPr>
             <w:fldChar w:fldCharType="separate"/>
           </w:r>
-          <w:hyperlink w:anchor="__RefHeading___Toc391_2738309569">
+          <w:hyperlink w:anchor="__RefHeading___Toc513_2622541029">
             <w:r>
               <w:rPr>
                 <w:rStyle w:val="IndexLink"/>
@@ -295,7 +295,7 @@
             </w:tabs>
             <w:rPr/>
           </w:pPr>
-          <w:hyperlink w:anchor="__RefHeading___Toc393_2738309569">
+          <w:hyperlink w:anchor="__RefHeading___Toc515_2622541029">
             <w:r>
               <w:rPr>
                 <w:rStyle w:val="IndexLink"/>
@@ -315,7 +315,7 @@
             </w:tabs>
             <w:rPr/>
           </w:pPr>
-          <w:hyperlink w:anchor="__RefHeading___Toc395_2738309569">
+          <w:hyperlink w:anchor="__RefHeading___Toc517_2622541029">
             <w:r>
               <w:rPr>
                 <w:rStyle w:val="IndexLink"/>
@@ -335,7 +335,7 @@
             </w:tabs>
             <w:rPr/>
           </w:pPr>
-          <w:hyperlink w:anchor="__RefHeading___Toc397_2738309569">
+          <w:hyperlink w:anchor="__RefHeading___Toc519_2622541029">
             <w:r>
               <w:rPr>
                 <w:rStyle w:val="IndexLink"/>
@@ -355,7 +355,7 @@
             </w:tabs>
             <w:rPr/>
           </w:pPr>
-          <w:hyperlink w:anchor="__RefHeading___Toc399_2738309569">
+          <w:hyperlink w:anchor="__RefHeading___Toc521_2622541029">
             <w:r>
               <w:rPr>
                 <w:rStyle w:val="IndexLink"/>
@@ -375,7 +375,7 @@
             </w:tabs>
             <w:rPr/>
           </w:pPr>
-          <w:hyperlink w:anchor="__RefHeading___Toc401_2738309569">
+          <w:hyperlink w:anchor="__RefHeading___Toc523_2622541029">
             <w:r>
               <w:rPr>
                 <w:rStyle w:val="IndexLink"/>
@@ -395,7 +395,7 @@
             </w:tabs>
             <w:rPr/>
           </w:pPr>
-          <w:hyperlink w:anchor="__RefHeading___Toc403_2738309569">
+          <w:hyperlink w:anchor="__RefHeading___Toc525_2622541029">
             <w:r>
               <w:rPr>
                 <w:rStyle w:val="IndexLink"/>
@@ -415,7 +415,7 @@
             </w:tabs>
             <w:rPr/>
           </w:pPr>
-          <w:hyperlink w:anchor="__RefHeading___Toc405_2738309569">
+          <w:hyperlink w:anchor="__RefHeading___Toc527_2622541029">
             <w:r>
               <w:rPr>
                 <w:rStyle w:val="IndexLink"/>
@@ -435,7 +435,7 @@
             </w:tabs>
             <w:rPr/>
           </w:pPr>
-          <w:hyperlink w:anchor="__RefHeading___Toc407_2738309569">
+          <w:hyperlink w:anchor="__RefHeading___Toc529_2622541029">
             <w:r>
               <w:rPr>
                 <w:rStyle w:val="IndexLink"/>
@@ -455,7 +455,7 @@
             </w:tabs>
             <w:rPr/>
           </w:pPr>
-          <w:hyperlink w:anchor="__RefHeading___Toc409_2738309569">
+          <w:hyperlink w:anchor="__RefHeading___Toc531_2622541029">
             <w:r>
               <w:rPr>
                 <w:rStyle w:val="IndexLink"/>
@@ -475,7 +475,7 @@
             </w:tabs>
             <w:rPr/>
           </w:pPr>
-          <w:hyperlink w:anchor="__RefHeading___Toc411_2738309569">
+          <w:hyperlink w:anchor="__RefHeading___Toc533_2622541029">
             <w:r>
               <w:rPr>
                 <w:rStyle w:val="IndexLink"/>
@@ -495,7 +495,7 @@
             </w:tabs>
             <w:rPr/>
           </w:pPr>
-          <w:hyperlink w:anchor="__RefHeading___Toc413_2738309569">
+          <w:hyperlink w:anchor="__RefHeading___Toc535_2622541029">
             <w:r>
               <w:rPr>
                 <w:rStyle w:val="IndexLink"/>
@@ -515,7 +515,7 @@
             </w:tabs>
             <w:rPr/>
           </w:pPr>
-          <w:hyperlink w:anchor="__RefHeading___Toc415_2738309569">
+          <w:hyperlink w:anchor="__RefHeading___Toc537_2622541029">
             <w:r>
               <w:rPr>
                 <w:rStyle w:val="IndexLink"/>
@@ -535,7 +535,7 @@
             </w:tabs>
             <w:rPr/>
           </w:pPr>
-          <w:hyperlink w:anchor="__RefHeading___Toc417_2738309569">
+          <w:hyperlink w:anchor="__RefHeading___Toc539_2622541029">
             <w:r>
               <w:rPr>
                 <w:rStyle w:val="IndexLink"/>
@@ -555,12 +555,32 @@
             </w:tabs>
             <w:rPr/>
           </w:pPr>
-          <w:hyperlink w:anchor="__RefHeading___Toc419_2738309569">
+          <w:hyperlink w:anchor="__RefHeading___Toc541_2622541029">
             <w:r>
               <w:rPr>
                 <w:rStyle w:val="IndexLink"/>
               </w:rPr>
               <w:t>9. Production mode (optional)</w:t>
+              <w:tab/>
+              <w:t>11</w:t>
+            </w:r>
+          </w:hyperlink>
+        </w:p>
+        <w:p>
+          <w:pPr>
+            <w:pStyle w:val="TOC2"/>
+            <w:tabs>
+              <w:tab w:val="clear" w:pos="9463"/>
+              <w:tab w:val="right" w:pos="9745" w:leader="dot"/>
+            </w:tabs>
+            <w:rPr/>
+          </w:pPr>
+          <w:hyperlink w:anchor="__RefHeading___Toc543_2622541029">
+            <w:r>
+              <w:rPr>
+                <w:rStyle w:val="IndexLink"/>
+              </w:rPr>
+              <w:t>9.1 Questionnaire channels: e-mail and WhatsApp</w:t>
               <w:tab/>
               <w:t>11</w:t>
             </w:r>
@@ -575,14 +595,14 @@
             </w:tabs>
             <w:rPr/>
           </w:pPr>
-          <w:hyperlink w:anchor="__RefHeading___Toc421_2738309569">
+          <w:hyperlink w:anchor="__RefHeading___Toc545_2622541029">
             <w:r>
               <w:rPr>
                 <w:rStyle w:val="IndexLink"/>
               </w:rPr>
               <w:t>10. If something goes wrong</w:t>
               <w:tab/>
-              <w:t>12</w:t>
+              <w:t>13</w:t>
             </w:r>
           </w:hyperlink>
           <w:r>
@@ -619,7 +639,7 @@
         <w:spacing w:before="0" w:after="200"/>
         <w:rPr/>
       </w:pPr>
-      <w:bookmarkStart w:id="0" w:name="__RefHeading___Toc391_2738309569"/>
+      <w:bookmarkStart w:id="0" w:name="__RefHeading___Toc513_2622541029"/>
       <w:bookmarkEnd w:id="0"/>
       <w:r>
         <w:rPr>
@@ -1083,7 +1103,7 @@
       <w:r>
         <w:br w:type="page"/>
       </w:r>
-      <w:bookmarkStart w:id="1" w:name="__RefHeading___Toc393_2738309569"/>
+      <w:bookmarkStart w:id="1" w:name="__RefHeading___Toc515_2622541029"/>
       <w:bookmarkEnd w:id="1"/>
       <w:r>
         <w:rPr>
@@ -1104,7 +1124,7 @@
         <w:spacing w:before="280" w:after="120"/>
         <w:rPr/>
       </w:pPr>
-      <w:bookmarkStart w:id="2" w:name="__RefHeading___Toc395_2738309569"/>
+      <w:bookmarkStart w:id="2" w:name="__RefHeading___Toc517_2622541029"/>
       <w:bookmarkEnd w:id="2"/>
       <w:r>
         <w:rPr>
@@ -1205,7 +1225,7 @@
         <w:spacing w:before="280" w:after="120"/>
         <w:rPr/>
       </w:pPr>
-      <w:bookmarkStart w:id="3" w:name="__RefHeading___Toc397_2738309569"/>
+      <w:bookmarkStart w:id="3" w:name="__RefHeading___Toc519_2622541029"/>
       <w:bookmarkEnd w:id="3"/>
       <w:r>
         <w:rPr>
@@ -1243,7 +1263,7 @@
         <w:spacing w:before="280" w:after="120"/>
         <w:rPr/>
       </w:pPr>
-      <w:bookmarkStart w:id="4" w:name="__RefHeading___Toc399_2738309569"/>
+      <w:bookmarkStart w:id="4" w:name="__RefHeading___Toc521_2622541029"/>
       <w:bookmarkEnd w:id="4"/>
       <w:r>
         <w:rPr>
@@ -1321,7 +1341,7 @@
         <w:spacing w:before="0" w:after="200"/>
         <w:rPr/>
       </w:pPr>
-      <w:bookmarkStart w:id="5" w:name="__RefHeading___Toc401_2738309569"/>
+      <w:bookmarkStart w:id="5" w:name="__RefHeading___Toc523_2622541029"/>
       <w:bookmarkEnd w:id="5"/>
       <w:r>
         <w:rPr>
@@ -1474,7 +1494,7 @@
       <w:r>
         <w:br w:type="page"/>
       </w:r>
-      <w:bookmarkStart w:id="6" w:name="__RefHeading___Toc403_2738309569"/>
+      <w:bookmarkStart w:id="6" w:name="__RefHeading___Toc525_2622541029"/>
       <w:bookmarkEnd w:id="6"/>
       <w:r>
         <w:rPr>
@@ -2114,7 +2134,7 @@
         <w:spacing w:before="0" w:after="200"/>
         <w:rPr/>
       </w:pPr>
-      <w:bookmarkStart w:id="7" w:name="__RefHeading___Toc405_2738309569"/>
+      <w:bookmarkStart w:id="7" w:name="__RefHeading___Toc527_2622541029"/>
       <w:bookmarkEnd w:id="7"/>
       <w:r>
         <w:rPr>
@@ -2321,7 +2341,7 @@
         <w:spacing w:before="0" w:after="200"/>
         <w:rPr/>
       </w:pPr>
-      <w:bookmarkStart w:id="8" w:name="__RefHeading___Toc407_2738309569"/>
+      <w:bookmarkStart w:id="8" w:name="__RefHeading___Toc529_2622541029"/>
       <w:bookmarkEnd w:id="8"/>
       <w:r>
         <w:rPr>
@@ -3066,7 +3086,7 @@
         <w:spacing w:before="0" w:after="200"/>
         <w:rPr/>
       </w:pPr>
-      <w:bookmarkStart w:id="9" w:name="__RefHeading___Toc409_2738309569"/>
+      <w:bookmarkStart w:id="9" w:name="__RefHeading___Toc531_2622541029"/>
       <w:bookmarkEnd w:id="9"/>
       <w:r>
         <w:rPr>
@@ -3501,7 +3521,7 @@
       <w:r>
         <w:br w:type="page"/>
       </w:r>
-      <w:bookmarkStart w:id="10" w:name="__RefHeading___Toc411_2738309569"/>
+      <w:bookmarkStart w:id="10" w:name="__RefHeading___Toc533_2622541029"/>
       <w:bookmarkEnd w:id="10"/>
       <w:r>
         <w:rPr>
@@ -3522,7 +3542,7 @@
         <w:spacing w:before="280" w:after="120"/>
         <w:rPr/>
       </w:pPr>
-      <w:bookmarkStart w:id="11" w:name="__RefHeading___Toc413_2738309569"/>
+      <w:bookmarkStart w:id="11" w:name="__RefHeading___Toc535_2622541029"/>
       <w:bookmarkEnd w:id="11"/>
       <w:r>
         <w:rPr>
@@ -3560,7 +3580,7 @@
         <w:spacing w:before="280" w:after="120"/>
         <w:rPr/>
       </w:pPr>
-      <w:bookmarkStart w:id="12" w:name="__RefHeading___Toc415_2738309569"/>
+      <w:bookmarkStart w:id="12" w:name="__RefHeading___Toc537_2622541029"/>
       <w:bookmarkEnd w:id="12"/>
       <w:r>
         <w:rPr>
@@ -3633,7 +3653,7 @@
         <w:spacing w:before="280" w:after="120"/>
         <w:rPr/>
       </w:pPr>
-      <w:bookmarkStart w:id="13" w:name="__RefHeading___Toc417_2738309569"/>
+      <w:bookmarkStart w:id="13" w:name="__RefHeading___Toc539_2622541029"/>
       <w:bookmarkEnd w:id="13"/>
       <w:r>
         <w:rPr>
@@ -3676,7 +3696,7 @@
         <w:spacing w:before="0" w:after="200"/>
         <w:rPr/>
       </w:pPr>
-      <w:bookmarkStart w:id="14" w:name="__RefHeading___Toc419_2738309569"/>
+      <w:bookmarkStart w:id="14" w:name="__RefHeading___Toc541_2622541029"/>
       <w:bookmarkEnd w:id="14"/>
       <w:r>
         <w:rPr>
@@ -4483,6 +4503,1330 @@
     </w:tbl>
     <w:p>
       <w:pPr>
+        <w:pStyle w:val="Heading2"/>
+        <w:keepNext w:val="true"/>
+        <w:spacing w:before="280" w:after="120"/>
+        <w:rPr/>
+      </w:pPr>
+      <w:bookmarkStart w:id="15" w:name="__RefHeading___Toc543_2622541029"/>
+      <w:bookmarkEnd w:id="15"/>
+      <w:r>
+        <w:rPr>
+          <w:rFonts w:eastAsia="Times New Roman" w:cs="Times New Roman"/>
+          <w:b/>
+          <w:bCs/>
+          <w:color w:val="3A3A3C"/>
+          <w:sz w:val="27"/>
+          <w:szCs w:val="27"/>
+        </w:rPr>
+        <w:t>9.1 Questionnaire channels: e-mail and WhatsApp</w:t>
+      </w:r>
+    </w:p>
+    <w:p>
+      <w:pPr>
+        <w:pStyle w:val="Normal"/>
+        <w:spacing w:lineRule="auto" w:line="276" w:before="0" w:after="120"/>
+        <w:jc w:val="both"/>
+        <w:rPr/>
+      </w:pPr>
+      <w:r>
+        <w:rPr>
+          <w:rFonts w:eastAsia="Times New Roman" w:cs="Times New Roman"/>
+          <w:color w:val="58595B"/>
+          <w:sz w:val="24"/>
+          <w:szCs w:val="24"/>
+        </w:rPr>
+        <w:t>Questionnaire invitations and reminders go out by e-mail (SMTP) and WhatsApp (WhatsApp Business Cloud API). Each organization can enter its own providers in Administration › Channels; the settings below give a platform default used by organizations that have none. Without any provider, messages are kept in the outbox (sandbox) and nothing is sent.</w:t>
+      </w:r>
+    </w:p>
+    <w:tbl>
+      <w:tblPr>
+        <w:tblW w:w="9746" w:type="dxa"/>
+        <w:jc w:val="left"/>
+        <w:tblInd w:w="0" w:type="dxa"/>
+        <w:tblLayout w:type="fixed"/>
+        <w:tblCellMar>
+          <w:top w:w="60" w:type="dxa"/>
+          <w:left w:w="100" w:type="dxa"/>
+          <w:bottom w:w="60" w:type="dxa"/>
+          <w:right w:w="100" w:type="dxa"/>
+        </w:tblCellMar>
+      </w:tblPr>
+      <w:tblGrid>
+        <w:gridCol w:w="2999"/>
+        <w:gridCol w:w="2401"/>
+        <w:gridCol w:w="4346"/>
+      </w:tblGrid>
+      <w:tr>
+        <w:trPr>
+          <w:tblHeader w:val="true"/>
+          <w:cantSplit w:val="true"/>
+        </w:trPr>
+        <w:tc>
+          <w:tcPr>
+            <w:tcW w:w="2999" w:type="dxa"/>
+            <w:tcBorders>
+              <w:top w:val="single" w:sz="4" w:space="0" w:color="E3E3E4"/>
+              <w:left w:val="single" w:sz="4" w:space="0" w:color="E3E3E4"/>
+              <w:bottom w:val="single" w:sz="4" w:space="0" w:color="E3E3E4"/>
+              <w:right w:val="single" w:sz="4" w:space="0" w:color="E3E3E4"/>
+            </w:tcBorders>
+            <w:shd w:color="auto" w:fill="F8931D" w:val="clear"/>
+          </w:tcPr>
+          <w:p>
+            <w:pPr>
+              <w:pStyle w:val="Normal"/>
+              <w:spacing w:before="0" w:after="20"/>
+              <w:rPr/>
+            </w:pPr>
+            <w:r>
+              <w:rPr>
+                <w:rFonts w:eastAsia="Times New Roman" w:cs="Times New Roman"/>
+                <w:b/>
+                <w:bCs/>
+                <w:color w:val="FFFFFF"/>
+                <w:sz w:val="19"/>
+                <w:szCs w:val="19"/>
+              </w:rPr>
+              <w:t>Setting (server/.env)</w:t>
+            </w:r>
+          </w:p>
+        </w:tc>
+        <w:tc>
+          <w:tcPr>
+            <w:tcW w:w="2401" w:type="dxa"/>
+            <w:tcBorders>
+              <w:top w:val="single" w:sz="4" w:space="0" w:color="E3E3E4"/>
+              <w:left w:val="single" w:sz="4" w:space="0" w:color="E3E3E4"/>
+              <w:bottom w:val="single" w:sz="4" w:space="0" w:color="E3E3E4"/>
+              <w:right w:val="single" w:sz="4" w:space="0" w:color="E3E3E4"/>
+            </w:tcBorders>
+            <w:shd w:color="auto" w:fill="F8931D" w:val="clear"/>
+          </w:tcPr>
+          <w:p>
+            <w:pPr>
+              <w:pStyle w:val="Normal"/>
+              <w:spacing w:before="0" w:after="20"/>
+              <w:rPr/>
+            </w:pPr>
+            <w:r>
+              <w:rPr>
+                <w:rFonts w:eastAsia="Times New Roman" w:cs="Times New Roman"/>
+                <w:b/>
+                <w:bCs/>
+                <w:color w:val="FFFFFF"/>
+                <w:sz w:val="19"/>
+                <w:szCs w:val="19"/>
+              </w:rPr>
+              <w:t>Default</w:t>
+            </w:r>
+          </w:p>
+        </w:tc>
+        <w:tc>
+          <w:tcPr>
+            <w:tcW w:w="4346" w:type="dxa"/>
+            <w:tcBorders>
+              <w:top w:val="single" w:sz="4" w:space="0" w:color="E3E3E4"/>
+              <w:left w:val="single" w:sz="4" w:space="0" w:color="E3E3E4"/>
+              <w:bottom w:val="single" w:sz="4" w:space="0" w:color="E3E3E4"/>
+              <w:right w:val="single" w:sz="4" w:space="0" w:color="E3E3E4"/>
+            </w:tcBorders>
+            <w:shd w:color="auto" w:fill="F8931D" w:val="clear"/>
+          </w:tcPr>
+          <w:p>
+            <w:pPr>
+              <w:pStyle w:val="Normal"/>
+              <w:spacing w:before="0" w:after="20"/>
+              <w:rPr/>
+            </w:pPr>
+            <w:r>
+              <w:rPr>
+                <w:rFonts w:eastAsia="Times New Roman" w:cs="Times New Roman"/>
+                <w:b/>
+                <w:bCs/>
+                <w:color w:val="FFFFFF"/>
+                <w:sz w:val="19"/>
+                <w:szCs w:val="19"/>
+              </w:rPr>
+              <w:t>Purpose</w:t>
+            </w:r>
+          </w:p>
+        </w:tc>
+      </w:tr>
+      <w:tr>
+        <w:trPr>
+          <w:cantSplit w:val="true"/>
+        </w:trPr>
+        <w:tc>
+          <w:tcPr>
+            <w:tcW w:w="2999" w:type="dxa"/>
+            <w:tcBorders>
+              <w:top w:val="single" w:sz="4" w:space="0" w:color="E3E3E4"/>
+              <w:left w:val="single" w:sz="4" w:space="0" w:color="E3E3E4"/>
+              <w:bottom w:val="single" w:sz="4" w:space="0" w:color="E3E3E4"/>
+              <w:right w:val="single" w:sz="4" w:space="0" w:color="E3E3E4"/>
+            </w:tcBorders>
+            <w:shd w:color="auto" w:fill="FFFFFF" w:val="clear"/>
+          </w:tcPr>
+          <w:p>
+            <w:pPr>
+              <w:pStyle w:val="Normal"/>
+              <w:spacing w:before="0" w:after="20"/>
+              <w:rPr/>
+            </w:pPr>
+            <w:r>
+              <w:rPr>
+                <w:rFonts w:eastAsia="Times New Roman" w:cs="Times New Roman"/>
+                <w:b w:val="false"/>
+                <w:bCs w:val="false"/>
+                <w:color w:val="58595B"/>
+                <w:sz w:val="19"/>
+                <w:szCs w:val="19"/>
+              </w:rPr>
+              <w:t>PUBLIC_URL</w:t>
+            </w:r>
+          </w:p>
+        </w:tc>
+        <w:tc>
+          <w:tcPr>
+            <w:tcW w:w="2401" w:type="dxa"/>
+            <w:tcBorders>
+              <w:top w:val="single" w:sz="4" w:space="0" w:color="E3E3E4"/>
+              <w:left w:val="single" w:sz="4" w:space="0" w:color="E3E3E4"/>
+              <w:bottom w:val="single" w:sz="4" w:space="0" w:color="E3E3E4"/>
+              <w:right w:val="single" w:sz="4" w:space="0" w:color="E3E3E4"/>
+            </w:tcBorders>
+            <w:shd w:color="auto" w:fill="FFFFFF" w:val="clear"/>
+          </w:tcPr>
+          <w:p>
+            <w:pPr>
+              <w:pStyle w:val="Normal"/>
+              <w:spacing w:before="0" w:after="20"/>
+              <w:rPr/>
+            </w:pPr>
+            <w:r>
+              <w:rPr>
+                <w:rFonts w:eastAsia="Times New Roman" w:cs="Times New Roman"/>
+                <w:b w:val="false"/>
+                <w:bCs w:val="false"/>
+                <w:color w:val="58595B"/>
+                <w:sz w:val="19"/>
+                <w:szCs w:val="19"/>
+              </w:rPr>
+              <w:t>address of the request</w:t>
+            </w:r>
+          </w:p>
+        </w:tc>
+        <w:tc>
+          <w:tcPr>
+            <w:tcW w:w="4346" w:type="dxa"/>
+            <w:tcBorders>
+              <w:top w:val="single" w:sz="4" w:space="0" w:color="E3E3E4"/>
+              <w:left w:val="single" w:sz="4" w:space="0" w:color="E3E3E4"/>
+              <w:bottom w:val="single" w:sz="4" w:space="0" w:color="E3E3E4"/>
+              <w:right w:val="single" w:sz="4" w:space="0" w:color="E3E3E4"/>
+            </w:tcBorders>
+            <w:shd w:color="auto" w:fill="FFFFFF" w:val="clear"/>
+          </w:tcPr>
+          <w:p>
+            <w:pPr>
+              <w:pStyle w:val="Normal"/>
+              <w:spacing w:before="0" w:after="20"/>
+              <w:rPr/>
+            </w:pPr>
+            <w:r>
+              <w:rPr>
+                <w:rFonts w:eastAsia="Times New Roman" w:cs="Times New Roman"/>
+                <w:b w:val="false"/>
+                <w:bCs w:val="false"/>
+                <w:color w:val="58595B"/>
+                <w:sz w:val="19"/>
+                <w:szCs w:val="19"/>
+              </w:rPr>
+              <w:t>Public address of the application, used in the personal links sent to respondents (for example https://skills.example.com)</w:t>
+            </w:r>
+          </w:p>
+        </w:tc>
+      </w:tr>
+      <w:tr>
+        <w:trPr>
+          <w:cantSplit w:val="true"/>
+        </w:trPr>
+        <w:tc>
+          <w:tcPr>
+            <w:tcW w:w="2999" w:type="dxa"/>
+            <w:tcBorders>
+              <w:top w:val="single" w:sz="4" w:space="0" w:color="E3E3E4"/>
+              <w:left w:val="single" w:sz="4" w:space="0" w:color="E3E3E4"/>
+              <w:bottom w:val="single" w:sz="4" w:space="0" w:color="E3E3E4"/>
+              <w:right w:val="single" w:sz="4" w:space="0" w:color="E3E3E4"/>
+            </w:tcBorders>
+            <w:shd w:color="auto" w:fill="F2F2F3" w:val="clear"/>
+          </w:tcPr>
+          <w:p>
+            <w:pPr>
+              <w:pStyle w:val="Normal"/>
+              <w:spacing w:before="0" w:after="20"/>
+              <w:rPr/>
+            </w:pPr>
+            <w:r>
+              <w:rPr>
+                <w:rFonts w:eastAsia="Times New Roman" w:cs="Times New Roman"/>
+                <w:b w:val="false"/>
+                <w:bCs w:val="false"/>
+                <w:color w:val="58595B"/>
+                <w:sz w:val="19"/>
+                <w:szCs w:val="19"/>
+              </w:rPr>
+              <w:t>CHANNEL_SECRET_KEY</w:t>
+            </w:r>
+          </w:p>
+        </w:tc>
+        <w:tc>
+          <w:tcPr>
+            <w:tcW w:w="2401" w:type="dxa"/>
+            <w:tcBorders>
+              <w:top w:val="single" w:sz="4" w:space="0" w:color="E3E3E4"/>
+              <w:left w:val="single" w:sz="4" w:space="0" w:color="E3E3E4"/>
+              <w:bottom w:val="single" w:sz="4" w:space="0" w:color="E3E3E4"/>
+              <w:right w:val="single" w:sz="4" w:space="0" w:color="E3E3E4"/>
+            </w:tcBorders>
+            <w:shd w:color="auto" w:fill="F2F2F3" w:val="clear"/>
+          </w:tcPr>
+          <w:p>
+            <w:pPr>
+              <w:pStyle w:val="Normal"/>
+              <w:spacing w:before="0" w:after="20"/>
+              <w:rPr/>
+            </w:pPr>
+            <w:r>
+              <w:rPr>
+                <w:rFonts w:eastAsia="Times New Roman" w:cs="Times New Roman"/>
+                <w:b w:val="false"/>
+                <w:bCs w:val="false"/>
+                <w:color w:val="58595B"/>
+                <w:sz w:val="19"/>
+                <w:szCs w:val="19"/>
+              </w:rPr>
+              <w:t>JWT_SECRET</w:t>
+            </w:r>
+          </w:p>
+        </w:tc>
+        <w:tc>
+          <w:tcPr>
+            <w:tcW w:w="4346" w:type="dxa"/>
+            <w:tcBorders>
+              <w:top w:val="single" w:sz="4" w:space="0" w:color="E3E3E4"/>
+              <w:left w:val="single" w:sz="4" w:space="0" w:color="E3E3E4"/>
+              <w:bottom w:val="single" w:sz="4" w:space="0" w:color="E3E3E4"/>
+              <w:right w:val="single" w:sz="4" w:space="0" w:color="E3E3E4"/>
+            </w:tcBorders>
+            <w:shd w:color="auto" w:fill="F2F2F3" w:val="clear"/>
+          </w:tcPr>
+          <w:p>
+            <w:pPr>
+              <w:pStyle w:val="Normal"/>
+              <w:spacing w:before="0" w:after="20"/>
+              <w:rPr/>
+            </w:pPr>
+            <w:r>
+              <w:rPr>
+                <w:rFonts w:eastAsia="Times New Roman" w:cs="Times New Roman"/>
+                <w:b w:val="false"/>
+                <w:bCs w:val="false"/>
+                <w:color w:val="58595B"/>
+                <w:sz w:val="19"/>
+                <w:szCs w:val="19"/>
+              </w:rPr>
+              <w:t>Key that encrypts the channel passwords and tokens (AES-256-GCM) — set a long private value and keep it</w:t>
+            </w:r>
+          </w:p>
+        </w:tc>
+      </w:tr>
+      <w:tr>
+        <w:trPr>
+          <w:cantSplit w:val="true"/>
+        </w:trPr>
+        <w:tc>
+          <w:tcPr>
+            <w:tcW w:w="2999" w:type="dxa"/>
+            <w:tcBorders>
+              <w:top w:val="single" w:sz="4" w:space="0" w:color="E3E3E4"/>
+              <w:left w:val="single" w:sz="4" w:space="0" w:color="E3E3E4"/>
+              <w:bottom w:val="single" w:sz="4" w:space="0" w:color="E3E3E4"/>
+              <w:right w:val="single" w:sz="4" w:space="0" w:color="E3E3E4"/>
+            </w:tcBorders>
+            <w:shd w:color="auto" w:fill="FFFFFF" w:val="clear"/>
+          </w:tcPr>
+          <w:p>
+            <w:pPr>
+              <w:pStyle w:val="Normal"/>
+              <w:spacing w:before="0" w:after="20"/>
+              <w:rPr/>
+            </w:pPr>
+            <w:r>
+              <w:rPr>
+                <w:rFonts w:eastAsia="Times New Roman" w:cs="Times New Roman"/>
+                <w:b w:val="false"/>
+                <w:bCs w:val="false"/>
+                <w:color w:val="58595B"/>
+                <w:sz w:val="19"/>
+                <w:szCs w:val="19"/>
+              </w:rPr>
+              <w:t>SMTP_HOST, SMTP_PORT</w:t>
+            </w:r>
+          </w:p>
+        </w:tc>
+        <w:tc>
+          <w:tcPr>
+            <w:tcW w:w="2401" w:type="dxa"/>
+            <w:tcBorders>
+              <w:top w:val="single" w:sz="4" w:space="0" w:color="E3E3E4"/>
+              <w:left w:val="single" w:sz="4" w:space="0" w:color="E3E3E4"/>
+              <w:bottom w:val="single" w:sz="4" w:space="0" w:color="E3E3E4"/>
+              <w:right w:val="single" w:sz="4" w:space="0" w:color="E3E3E4"/>
+            </w:tcBorders>
+            <w:shd w:color="auto" w:fill="FFFFFF" w:val="clear"/>
+          </w:tcPr>
+          <w:p>
+            <w:pPr>
+              <w:pStyle w:val="Normal"/>
+              <w:spacing w:before="0" w:after="20"/>
+              <w:rPr/>
+            </w:pPr>
+            <w:r>
+              <w:rPr>
+                <w:rFonts w:eastAsia="Times New Roman" w:cs="Times New Roman"/>
+                <w:b w:val="false"/>
+                <w:bCs w:val="false"/>
+                <w:color w:val="58595B"/>
+                <w:sz w:val="19"/>
+                <w:szCs w:val="19"/>
+              </w:rPr>
+              <w:t>—</w:t>
+            </w:r>
+            <w:r>
+              <w:rPr>
+                <w:rFonts w:eastAsia="Times New Roman" w:cs="Times New Roman"/>
+                <w:b w:val="false"/>
+                <w:bCs w:val="false"/>
+                <w:color w:val="58595B"/>
+                <w:sz w:val="19"/>
+                <w:szCs w:val="19"/>
+              </w:rPr>
+              <w:t>, 587</w:t>
+            </w:r>
+          </w:p>
+        </w:tc>
+        <w:tc>
+          <w:tcPr>
+            <w:tcW w:w="4346" w:type="dxa"/>
+            <w:tcBorders>
+              <w:top w:val="single" w:sz="4" w:space="0" w:color="E3E3E4"/>
+              <w:left w:val="single" w:sz="4" w:space="0" w:color="E3E3E4"/>
+              <w:bottom w:val="single" w:sz="4" w:space="0" w:color="E3E3E4"/>
+              <w:right w:val="single" w:sz="4" w:space="0" w:color="E3E3E4"/>
+            </w:tcBorders>
+            <w:shd w:color="auto" w:fill="FFFFFF" w:val="clear"/>
+          </w:tcPr>
+          <w:p>
+            <w:pPr>
+              <w:pStyle w:val="Normal"/>
+              <w:spacing w:before="0" w:after="20"/>
+              <w:rPr/>
+            </w:pPr>
+            <w:r>
+              <w:rPr>
+                <w:rFonts w:eastAsia="Times New Roman" w:cs="Times New Roman"/>
+                <w:b w:val="false"/>
+                <w:bCs w:val="false"/>
+                <w:color w:val="58595B"/>
+                <w:sz w:val="19"/>
+                <w:szCs w:val="19"/>
+              </w:rPr>
+              <w:t>Mail server and port</w:t>
+            </w:r>
+          </w:p>
+        </w:tc>
+      </w:tr>
+      <w:tr>
+        <w:trPr>
+          <w:cantSplit w:val="true"/>
+        </w:trPr>
+        <w:tc>
+          <w:tcPr>
+            <w:tcW w:w="2999" w:type="dxa"/>
+            <w:tcBorders>
+              <w:top w:val="single" w:sz="4" w:space="0" w:color="E3E3E4"/>
+              <w:left w:val="single" w:sz="4" w:space="0" w:color="E3E3E4"/>
+              <w:bottom w:val="single" w:sz="4" w:space="0" w:color="E3E3E4"/>
+              <w:right w:val="single" w:sz="4" w:space="0" w:color="E3E3E4"/>
+            </w:tcBorders>
+            <w:shd w:color="auto" w:fill="F2F2F3" w:val="clear"/>
+          </w:tcPr>
+          <w:p>
+            <w:pPr>
+              <w:pStyle w:val="Normal"/>
+              <w:spacing w:before="0" w:after="20"/>
+              <w:rPr/>
+            </w:pPr>
+            <w:r>
+              <w:rPr>
+                <w:rFonts w:eastAsia="Times New Roman" w:cs="Times New Roman"/>
+                <w:b w:val="false"/>
+                <w:bCs w:val="false"/>
+                <w:color w:val="58595B"/>
+                <w:sz w:val="19"/>
+                <w:szCs w:val="19"/>
+              </w:rPr>
+              <w:t>SMTP_SECURE</w:t>
+            </w:r>
+          </w:p>
+        </w:tc>
+        <w:tc>
+          <w:tcPr>
+            <w:tcW w:w="2401" w:type="dxa"/>
+            <w:tcBorders>
+              <w:top w:val="single" w:sz="4" w:space="0" w:color="E3E3E4"/>
+              <w:left w:val="single" w:sz="4" w:space="0" w:color="E3E3E4"/>
+              <w:bottom w:val="single" w:sz="4" w:space="0" w:color="E3E3E4"/>
+              <w:right w:val="single" w:sz="4" w:space="0" w:color="E3E3E4"/>
+            </w:tcBorders>
+            <w:shd w:color="auto" w:fill="F2F2F3" w:val="clear"/>
+          </w:tcPr>
+          <w:p>
+            <w:pPr>
+              <w:pStyle w:val="Normal"/>
+              <w:spacing w:before="0" w:after="20"/>
+              <w:rPr/>
+            </w:pPr>
+            <w:r>
+              <w:rPr>
+                <w:rFonts w:eastAsia="Times New Roman" w:cs="Times New Roman"/>
+                <w:b w:val="false"/>
+                <w:bCs w:val="false"/>
+                <w:color w:val="58595B"/>
+                <w:sz w:val="19"/>
+                <w:szCs w:val="19"/>
+              </w:rPr>
+              <w:t>false</w:t>
+            </w:r>
+          </w:p>
+        </w:tc>
+        <w:tc>
+          <w:tcPr>
+            <w:tcW w:w="4346" w:type="dxa"/>
+            <w:tcBorders>
+              <w:top w:val="single" w:sz="4" w:space="0" w:color="E3E3E4"/>
+              <w:left w:val="single" w:sz="4" w:space="0" w:color="E3E3E4"/>
+              <w:bottom w:val="single" w:sz="4" w:space="0" w:color="E3E3E4"/>
+              <w:right w:val="single" w:sz="4" w:space="0" w:color="E3E3E4"/>
+            </w:tcBorders>
+            <w:shd w:color="auto" w:fill="F2F2F3" w:val="clear"/>
+          </w:tcPr>
+          <w:p>
+            <w:pPr>
+              <w:pStyle w:val="Normal"/>
+              <w:spacing w:before="0" w:after="20"/>
+              <w:rPr/>
+            </w:pPr>
+            <w:r>
+              <w:rPr>
+                <w:rFonts w:eastAsia="Times New Roman" w:cs="Times New Roman"/>
+                <w:b w:val="false"/>
+                <w:bCs w:val="false"/>
+                <w:color w:val="58595B"/>
+                <w:sz w:val="19"/>
+                <w:szCs w:val="19"/>
+              </w:rPr>
+              <w:t>true for TLS from the start (port 465)</w:t>
+            </w:r>
+          </w:p>
+        </w:tc>
+      </w:tr>
+      <w:tr>
+        <w:trPr>
+          <w:cantSplit w:val="true"/>
+        </w:trPr>
+        <w:tc>
+          <w:tcPr>
+            <w:tcW w:w="2999" w:type="dxa"/>
+            <w:tcBorders>
+              <w:top w:val="single" w:sz="4" w:space="0" w:color="E3E3E4"/>
+              <w:left w:val="single" w:sz="4" w:space="0" w:color="E3E3E4"/>
+              <w:bottom w:val="single" w:sz="4" w:space="0" w:color="E3E3E4"/>
+              <w:right w:val="single" w:sz="4" w:space="0" w:color="E3E3E4"/>
+            </w:tcBorders>
+            <w:shd w:color="auto" w:fill="FFFFFF" w:val="clear"/>
+          </w:tcPr>
+          <w:p>
+            <w:pPr>
+              <w:pStyle w:val="Normal"/>
+              <w:spacing w:before="0" w:after="20"/>
+              <w:rPr/>
+            </w:pPr>
+            <w:r>
+              <w:rPr>
+                <w:rFonts w:eastAsia="Times New Roman" w:cs="Times New Roman"/>
+                <w:b w:val="false"/>
+                <w:bCs w:val="false"/>
+                <w:color w:val="58595B"/>
+                <w:sz w:val="19"/>
+                <w:szCs w:val="19"/>
+              </w:rPr>
+              <w:t>SMTP_USER, SMTP_PASS</w:t>
+            </w:r>
+          </w:p>
+        </w:tc>
+        <w:tc>
+          <w:tcPr>
+            <w:tcW w:w="2401" w:type="dxa"/>
+            <w:tcBorders>
+              <w:top w:val="single" w:sz="4" w:space="0" w:color="E3E3E4"/>
+              <w:left w:val="single" w:sz="4" w:space="0" w:color="E3E3E4"/>
+              <w:bottom w:val="single" w:sz="4" w:space="0" w:color="E3E3E4"/>
+              <w:right w:val="single" w:sz="4" w:space="0" w:color="E3E3E4"/>
+            </w:tcBorders>
+            <w:shd w:color="auto" w:fill="FFFFFF" w:val="clear"/>
+          </w:tcPr>
+          <w:p>
+            <w:pPr>
+              <w:pStyle w:val="Normal"/>
+              <w:spacing w:before="0" w:after="20"/>
+              <w:rPr/>
+            </w:pPr>
+            <w:r>
+              <w:rPr>
+                <w:rFonts w:eastAsia="Times New Roman" w:cs="Times New Roman"/>
+                <w:b w:val="false"/>
+                <w:bCs w:val="false"/>
+                <w:color w:val="58595B"/>
+                <w:sz w:val="19"/>
+                <w:szCs w:val="19"/>
+              </w:rPr>
+              <w:t>—</w:t>
+            </w:r>
+          </w:p>
+        </w:tc>
+        <w:tc>
+          <w:tcPr>
+            <w:tcW w:w="4346" w:type="dxa"/>
+            <w:tcBorders>
+              <w:top w:val="single" w:sz="4" w:space="0" w:color="E3E3E4"/>
+              <w:left w:val="single" w:sz="4" w:space="0" w:color="E3E3E4"/>
+              <w:bottom w:val="single" w:sz="4" w:space="0" w:color="E3E3E4"/>
+              <w:right w:val="single" w:sz="4" w:space="0" w:color="E3E3E4"/>
+            </w:tcBorders>
+            <w:shd w:color="auto" w:fill="FFFFFF" w:val="clear"/>
+          </w:tcPr>
+          <w:p>
+            <w:pPr>
+              <w:pStyle w:val="Normal"/>
+              <w:spacing w:before="0" w:after="20"/>
+              <w:rPr/>
+            </w:pPr>
+            <w:r>
+              <w:rPr>
+                <w:rFonts w:eastAsia="Times New Roman" w:cs="Times New Roman"/>
+                <w:b w:val="false"/>
+                <w:bCs w:val="false"/>
+                <w:color w:val="58595B"/>
+                <w:sz w:val="19"/>
+                <w:szCs w:val="19"/>
+              </w:rPr>
+              <w:t>Mail account</w:t>
+            </w:r>
+          </w:p>
+        </w:tc>
+      </w:tr>
+      <w:tr>
+        <w:trPr>
+          <w:cantSplit w:val="true"/>
+        </w:trPr>
+        <w:tc>
+          <w:tcPr>
+            <w:tcW w:w="2999" w:type="dxa"/>
+            <w:tcBorders>
+              <w:top w:val="single" w:sz="4" w:space="0" w:color="E3E3E4"/>
+              <w:left w:val="single" w:sz="4" w:space="0" w:color="E3E3E4"/>
+              <w:bottom w:val="single" w:sz="4" w:space="0" w:color="E3E3E4"/>
+              <w:right w:val="single" w:sz="4" w:space="0" w:color="E3E3E4"/>
+            </w:tcBorders>
+            <w:shd w:color="auto" w:fill="F2F2F3" w:val="clear"/>
+          </w:tcPr>
+          <w:p>
+            <w:pPr>
+              <w:pStyle w:val="Normal"/>
+              <w:spacing w:before="0" w:after="20"/>
+              <w:rPr/>
+            </w:pPr>
+            <w:r>
+              <w:rPr>
+                <w:rFonts w:eastAsia="Times New Roman" w:cs="Times New Roman"/>
+                <w:b w:val="false"/>
+                <w:bCs w:val="false"/>
+                <w:color w:val="58595B"/>
+                <w:sz w:val="19"/>
+                <w:szCs w:val="19"/>
+              </w:rPr>
+              <w:t>SMTP_FROM</w:t>
+            </w:r>
+          </w:p>
+        </w:tc>
+        <w:tc>
+          <w:tcPr>
+            <w:tcW w:w="2401" w:type="dxa"/>
+            <w:tcBorders>
+              <w:top w:val="single" w:sz="4" w:space="0" w:color="E3E3E4"/>
+              <w:left w:val="single" w:sz="4" w:space="0" w:color="E3E3E4"/>
+              <w:bottom w:val="single" w:sz="4" w:space="0" w:color="E3E3E4"/>
+              <w:right w:val="single" w:sz="4" w:space="0" w:color="E3E3E4"/>
+            </w:tcBorders>
+            <w:shd w:color="auto" w:fill="F2F2F3" w:val="clear"/>
+          </w:tcPr>
+          <w:p>
+            <w:pPr>
+              <w:pStyle w:val="Normal"/>
+              <w:spacing w:before="0" w:after="20"/>
+              <w:rPr/>
+            </w:pPr>
+            <w:r>
+              <w:rPr>
+                <w:rFonts w:eastAsia="Times New Roman" w:cs="Times New Roman"/>
+                <w:b w:val="false"/>
+                <w:bCs w:val="false"/>
+                <w:color w:val="58595B"/>
+                <w:sz w:val="19"/>
+                <w:szCs w:val="19"/>
+              </w:rPr>
+              <w:t>—</w:t>
+            </w:r>
+          </w:p>
+        </w:tc>
+        <w:tc>
+          <w:tcPr>
+            <w:tcW w:w="4346" w:type="dxa"/>
+            <w:tcBorders>
+              <w:top w:val="single" w:sz="4" w:space="0" w:color="E3E3E4"/>
+              <w:left w:val="single" w:sz="4" w:space="0" w:color="E3E3E4"/>
+              <w:bottom w:val="single" w:sz="4" w:space="0" w:color="E3E3E4"/>
+              <w:right w:val="single" w:sz="4" w:space="0" w:color="E3E3E4"/>
+            </w:tcBorders>
+            <w:shd w:color="auto" w:fill="F2F2F3" w:val="clear"/>
+          </w:tcPr>
+          <w:p>
+            <w:pPr>
+              <w:pStyle w:val="Normal"/>
+              <w:spacing w:before="0" w:after="20"/>
+              <w:rPr/>
+            </w:pPr>
+            <w:r>
+              <w:rPr>
+                <w:rFonts w:eastAsia="Times New Roman" w:cs="Times New Roman"/>
+                <w:b w:val="false"/>
+                <w:bCs w:val="false"/>
+                <w:color w:val="58595B"/>
+                <w:sz w:val="19"/>
+                <w:szCs w:val="19"/>
+              </w:rPr>
+              <w:t>Sender address shown to respondents</w:t>
+            </w:r>
+          </w:p>
+        </w:tc>
+      </w:tr>
+      <w:tr>
+        <w:trPr>
+          <w:cantSplit w:val="true"/>
+        </w:trPr>
+        <w:tc>
+          <w:tcPr>
+            <w:tcW w:w="2999" w:type="dxa"/>
+            <w:tcBorders>
+              <w:top w:val="single" w:sz="4" w:space="0" w:color="E3E3E4"/>
+              <w:left w:val="single" w:sz="4" w:space="0" w:color="E3E3E4"/>
+              <w:bottom w:val="single" w:sz="4" w:space="0" w:color="E3E3E4"/>
+              <w:right w:val="single" w:sz="4" w:space="0" w:color="E3E3E4"/>
+            </w:tcBorders>
+            <w:shd w:color="auto" w:fill="FFFFFF" w:val="clear"/>
+          </w:tcPr>
+          <w:p>
+            <w:pPr>
+              <w:pStyle w:val="Normal"/>
+              <w:spacing w:before="0" w:after="20"/>
+              <w:rPr/>
+            </w:pPr>
+            <w:r>
+              <w:rPr>
+                <w:rFonts w:eastAsia="Times New Roman" w:cs="Times New Roman"/>
+                <w:b w:val="false"/>
+                <w:bCs w:val="false"/>
+                <w:color w:val="58595B"/>
+                <w:sz w:val="19"/>
+                <w:szCs w:val="19"/>
+              </w:rPr>
+              <w:t>WHATSAPP_TOKEN</w:t>
+            </w:r>
+          </w:p>
+        </w:tc>
+        <w:tc>
+          <w:tcPr>
+            <w:tcW w:w="2401" w:type="dxa"/>
+            <w:tcBorders>
+              <w:top w:val="single" w:sz="4" w:space="0" w:color="E3E3E4"/>
+              <w:left w:val="single" w:sz="4" w:space="0" w:color="E3E3E4"/>
+              <w:bottom w:val="single" w:sz="4" w:space="0" w:color="E3E3E4"/>
+              <w:right w:val="single" w:sz="4" w:space="0" w:color="E3E3E4"/>
+            </w:tcBorders>
+            <w:shd w:color="auto" w:fill="FFFFFF" w:val="clear"/>
+          </w:tcPr>
+          <w:p>
+            <w:pPr>
+              <w:pStyle w:val="Normal"/>
+              <w:spacing w:before="0" w:after="20"/>
+              <w:rPr/>
+            </w:pPr>
+            <w:r>
+              <w:rPr>
+                <w:rFonts w:eastAsia="Times New Roman" w:cs="Times New Roman"/>
+                <w:b w:val="false"/>
+                <w:bCs w:val="false"/>
+                <w:color w:val="58595B"/>
+                <w:sz w:val="19"/>
+                <w:szCs w:val="19"/>
+              </w:rPr>
+              <w:t>—</w:t>
+            </w:r>
+          </w:p>
+        </w:tc>
+        <w:tc>
+          <w:tcPr>
+            <w:tcW w:w="4346" w:type="dxa"/>
+            <w:tcBorders>
+              <w:top w:val="single" w:sz="4" w:space="0" w:color="E3E3E4"/>
+              <w:left w:val="single" w:sz="4" w:space="0" w:color="E3E3E4"/>
+              <w:bottom w:val="single" w:sz="4" w:space="0" w:color="E3E3E4"/>
+              <w:right w:val="single" w:sz="4" w:space="0" w:color="E3E3E4"/>
+            </w:tcBorders>
+            <w:shd w:color="auto" w:fill="FFFFFF" w:val="clear"/>
+          </w:tcPr>
+          <w:p>
+            <w:pPr>
+              <w:pStyle w:val="Normal"/>
+              <w:spacing w:before="0" w:after="20"/>
+              <w:rPr/>
+            </w:pPr>
+            <w:r>
+              <w:rPr>
+                <w:rFonts w:eastAsia="Times New Roman" w:cs="Times New Roman"/>
+                <w:b w:val="false"/>
+                <w:bCs w:val="false"/>
+                <w:color w:val="58595B"/>
+                <w:sz w:val="19"/>
+                <w:szCs w:val="19"/>
+              </w:rPr>
+              <w:t>Access token of the WhatsApp Business app</w:t>
+            </w:r>
+          </w:p>
+        </w:tc>
+      </w:tr>
+      <w:tr>
+        <w:trPr>
+          <w:cantSplit w:val="true"/>
+        </w:trPr>
+        <w:tc>
+          <w:tcPr>
+            <w:tcW w:w="2999" w:type="dxa"/>
+            <w:tcBorders>
+              <w:top w:val="single" w:sz="4" w:space="0" w:color="E3E3E4"/>
+              <w:left w:val="single" w:sz="4" w:space="0" w:color="E3E3E4"/>
+              <w:bottom w:val="single" w:sz="4" w:space="0" w:color="E3E3E4"/>
+              <w:right w:val="single" w:sz="4" w:space="0" w:color="E3E3E4"/>
+            </w:tcBorders>
+            <w:shd w:color="auto" w:fill="F2F2F3" w:val="clear"/>
+          </w:tcPr>
+          <w:p>
+            <w:pPr>
+              <w:pStyle w:val="Normal"/>
+              <w:spacing w:before="0" w:after="20"/>
+              <w:rPr/>
+            </w:pPr>
+            <w:r>
+              <w:rPr>
+                <w:rFonts w:eastAsia="Times New Roman" w:cs="Times New Roman"/>
+                <w:b w:val="false"/>
+                <w:bCs w:val="false"/>
+                <w:color w:val="58595B"/>
+                <w:sz w:val="19"/>
+                <w:szCs w:val="19"/>
+              </w:rPr>
+              <w:t>WHATSAPP_PHONE_NUMBER_ID</w:t>
+            </w:r>
+          </w:p>
+        </w:tc>
+        <w:tc>
+          <w:tcPr>
+            <w:tcW w:w="2401" w:type="dxa"/>
+            <w:tcBorders>
+              <w:top w:val="single" w:sz="4" w:space="0" w:color="E3E3E4"/>
+              <w:left w:val="single" w:sz="4" w:space="0" w:color="E3E3E4"/>
+              <w:bottom w:val="single" w:sz="4" w:space="0" w:color="E3E3E4"/>
+              <w:right w:val="single" w:sz="4" w:space="0" w:color="E3E3E4"/>
+            </w:tcBorders>
+            <w:shd w:color="auto" w:fill="F2F2F3" w:val="clear"/>
+          </w:tcPr>
+          <w:p>
+            <w:pPr>
+              <w:pStyle w:val="Normal"/>
+              <w:spacing w:before="0" w:after="20"/>
+              <w:rPr/>
+            </w:pPr>
+            <w:r>
+              <w:rPr>
+                <w:rFonts w:eastAsia="Times New Roman" w:cs="Times New Roman"/>
+                <w:b w:val="false"/>
+                <w:bCs w:val="false"/>
+                <w:color w:val="58595B"/>
+                <w:sz w:val="19"/>
+                <w:szCs w:val="19"/>
+              </w:rPr>
+              <w:t>—</w:t>
+            </w:r>
+          </w:p>
+        </w:tc>
+        <w:tc>
+          <w:tcPr>
+            <w:tcW w:w="4346" w:type="dxa"/>
+            <w:tcBorders>
+              <w:top w:val="single" w:sz="4" w:space="0" w:color="E3E3E4"/>
+              <w:left w:val="single" w:sz="4" w:space="0" w:color="E3E3E4"/>
+              <w:bottom w:val="single" w:sz="4" w:space="0" w:color="E3E3E4"/>
+              <w:right w:val="single" w:sz="4" w:space="0" w:color="E3E3E4"/>
+            </w:tcBorders>
+            <w:shd w:color="auto" w:fill="F2F2F3" w:val="clear"/>
+          </w:tcPr>
+          <w:p>
+            <w:pPr>
+              <w:pStyle w:val="Normal"/>
+              <w:spacing w:before="0" w:after="20"/>
+              <w:rPr/>
+            </w:pPr>
+            <w:r>
+              <w:rPr>
+                <w:rFonts w:eastAsia="Times New Roman" w:cs="Times New Roman"/>
+                <w:b w:val="false"/>
+                <w:bCs w:val="false"/>
+                <w:color w:val="58595B"/>
+                <w:sz w:val="19"/>
+                <w:szCs w:val="19"/>
+              </w:rPr>
+              <w:t>Phone number ID from Meta › WhatsApp › API setup</w:t>
+            </w:r>
+          </w:p>
+        </w:tc>
+      </w:tr>
+      <w:tr>
+        <w:trPr>
+          <w:cantSplit w:val="true"/>
+        </w:trPr>
+        <w:tc>
+          <w:tcPr>
+            <w:tcW w:w="2999" w:type="dxa"/>
+            <w:tcBorders>
+              <w:top w:val="single" w:sz="4" w:space="0" w:color="E3E3E4"/>
+              <w:left w:val="single" w:sz="4" w:space="0" w:color="E3E3E4"/>
+              <w:bottom w:val="single" w:sz="4" w:space="0" w:color="E3E3E4"/>
+              <w:right w:val="single" w:sz="4" w:space="0" w:color="E3E3E4"/>
+            </w:tcBorders>
+            <w:shd w:color="auto" w:fill="FFFFFF" w:val="clear"/>
+          </w:tcPr>
+          <w:p>
+            <w:pPr>
+              <w:pStyle w:val="Normal"/>
+              <w:spacing w:before="0" w:after="20"/>
+              <w:rPr/>
+            </w:pPr>
+            <w:r>
+              <w:rPr>
+                <w:rFonts w:eastAsia="Times New Roman" w:cs="Times New Roman"/>
+                <w:b w:val="false"/>
+                <w:bCs w:val="false"/>
+                <w:color w:val="58595B"/>
+                <w:sz w:val="19"/>
+                <w:szCs w:val="19"/>
+              </w:rPr>
+              <w:t>WHATSAPP_TEMPLATE, WHATSAPP_TEMPLATE_LANG</w:t>
+            </w:r>
+          </w:p>
+        </w:tc>
+        <w:tc>
+          <w:tcPr>
+            <w:tcW w:w="2401" w:type="dxa"/>
+            <w:tcBorders>
+              <w:top w:val="single" w:sz="4" w:space="0" w:color="E3E3E4"/>
+              <w:left w:val="single" w:sz="4" w:space="0" w:color="E3E3E4"/>
+              <w:bottom w:val="single" w:sz="4" w:space="0" w:color="E3E3E4"/>
+              <w:right w:val="single" w:sz="4" w:space="0" w:color="E3E3E4"/>
+            </w:tcBorders>
+            <w:shd w:color="auto" w:fill="FFFFFF" w:val="clear"/>
+          </w:tcPr>
+          <w:p>
+            <w:pPr>
+              <w:pStyle w:val="Normal"/>
+              <w:spacing w:before="0" w:after="20"/>
+              <w:rPr/>
+            </w:pPr>
+            <w:r>
+              <w:rPr>
+                <w:rFonts w:eastAsia="Times New Roman" w:cs="Times New Roman"/>
+                <w:b w:val="false"/>
+                <w:bCs w:val="false"/>
+                <w:color w:val="58595B"/>
+                <w:sz w:val="19"/>
+                <w:szCs w:val="19"/>
+              </w:rPr>
+              <w:t>—</w:t>
+            </w:r>
+          </w:p>
+        </w:tc>
+        <w:tc>
+          <w:tcPr>
+            <w:tcW w:w="4346" w:type="dxa"/>
+            <w:tcBorders>
+              <w:top w:val="single" w:sz="4" w:space="0" w:color="E3E3E4"/>
+              <w:left w:val="single" w:sz="4" w:space="0" w:color="E3E3E4"/>
+              <w:bottom w:val="single" w:sz="4" w:space="0" w:color="E3E3E4"/>
+              <w:right w:val="single" w:sz="4" w:space="0" w:color="E3E3E4"/>
+            </w:tcBorders>
+            <w:shd w:color="auto" w:fill="FFFFFF" w:val="clear"/>
+          </w:tcPr>
+          <w:p>
+            <w:pPr>
+              <w:pStyle w:val="Normal"/>
+              <w:spacing w:before="0" w:after="20"/>
+              <w:rPr/>
+            </w:pPr>
+            <w:r>
+              <w:rPr>
+                <w:rFonts w:eastAsia="Times New Roman" w:cs="Times New Roman"/>
+                <w:b w:val="false"/>
+                <w:bCs w:val="false"/>
+                <w:color w:val="58595B"/>
+                <w:sz w:val="19"/>
+                <w:szCs w:val="19"/>
+              </w:rPr>
+              <w:t>Approved message template used for the first contact, and its language code</w:t>
+            </w:r>
+          </w:p>
+        </w:tc>
+      </w:tr>
+      <w:tr>
+        <w:trPr>
+          <w:cantSplit w:val="true"/>
+        </w:trPr>
+        <w:tc>
+          <w:tcPr>
+            <w:tcW w:w="2999" w:type="dxa"/>
+            <w:tcBorders>
+              <w:top w:val="single" w:sz="4" w:space="0" w:color="E3E3E4"/>
+              <w:left w:val="single" w:sz="4" w:space="0" w:color="E3E3E4"/>
+              <w:bottom w:val="single" w:sz="4" w:space="0" w:color="E3E3E4"/>
+              <w:right w:val="single" w:sz="4" w:space="0" w:color="E3E3E4"/>
+            </w:tcBorders>
+            <w:shd w:color="auto" w:fill="F2F2F3" w:val="clear"/>
+          </w:tcPr>
+          <w:p>
+            <w:pPr>
+              <w:pStyle w:val="Normal"/>
+              <w:spacing w:before="0" w:after="20"/>
+              <w:rPr/>
+            </w:pPr>
+            <w:r>
+              <w:rPr>
+                <w:rFonts w:eastAsia="Times New Roman" w:cs="Times New Roman"/>
+                <w:b w:val="false"/>
+                <w:bCs w:val="false"/>
+                <w:color w:val="58595B"/>
+                <w:sz w:val="19"/>
+                <w:szCs w:val="19"/>
+              </w:rPr>
+              <w:t>WHATSAPP_VERIFY_TOKEN</w:t>
+            </w:r>
+          </w:p>
+        </w:tc>
+        <w:tc>
+          <w:tcPr>
+            <w:tcW w:w="2401" w:type="dxa"/>
+            <w:tcBorders>
+              <w:top w:val="single" w:sz="4" w:space="0" w:color="E3E3E4"/>
+              <w:left w:val="single" w:sz="4" w:space="0" w:color="E3E3E4"/>
+              <w:bottom w:val="single" w:sz="4" w:space="0" w:color="E3E3E4"/>
+              <w:right w:val="single" w:sz="4" w:space="0" w:color="E3E3E4"/>
+            </w:tcBorders>
+            <w:shd w:color="auto" w:fill="F2F2F3" w:val="clear"/>
+          </w:tcPr>
+          <w:p>
+            <w:pPr>
+              <w:pStyle w:val="Normal"/>
+              <w:spacing w:before="0" w:after="20"/>
+              <w:rPr/>
+            </w:pPr>
+            <w:r>
+              <w:rPr>
+                <w:rFonts w:eastAsia="Times New Roman" w:cs="Times New Roman"/>
+                <w:b w:val="false"/>
+                <w:bCs w:val="false"/>
+                <w:color w:val="58595B"/>
+                <w:sz w:val="19"/>
+                <w:szCs w:val="19"/>
+              </w:rPr>
+              <w:t>—</w:t>
+            </w:r>
+          </w:p>
+        </w:tc>
+        <w:tc>
+          <w:tcPr>
+            <w:tcW w:w="4346" w:type="dxa"/>
+            <w:tcBorders>
+              <w:top w:val="single" w:sz="4" w:space="0" w:color="E3E3E4"/>
+              <w:left w:val="single" w:sz="4" w:space="0" w:color="E3E3E4"/>
+              <w:bottom w:val="single" w:sz="4" w:space="0" w:color="E3E3E4"/>
+              <w:right w:val="single" w:sz="4" w:space="0" w:color="E3E3E4"/>
+            </w:tcBorders>
+            <w:shd w:color="auto" w:fill="F2F2F3" w:val="clear"/>
+          </w:tcPr>
+          <w:p>
+            <w:pPr>
+              <w:pStyle w:val="Normal"/>
+              <w:spacing w:before="0" w:after="20"/>
+              <w:rPr/>
+            </w:pPr>
+            <w:r>
+              <w:rPr>
+                <w:rFonts w:eastAsia="Times New Roman" w:cs="Times New Roman"/>
+                <w:b w:val="false"/>
+                <w:bCs w:val="false"/>
+                <w:color w:val="58595B"/>
+                <w:sz w:val="19"/>
+                <w:szCs w:val="19"/>
+              </w:rPr>
+              <w:t>Token you choose and type in Meta when declaring the webhook</w:t>
+            </w:r>
+          </w:p>
+        </w:tc>
+      </w:tr>
+      <w:tr>
+        <w:trPr>
+          <w:cantSplit w:val="true"/>
+        </w:trPr>
+        <w:tc>
+          <w:tcPr>
+            <w:tcW w:w="2999" w:type="dxa"/>
+            <w:tcBorders>
+              <w:top w:val="single" w:sz="4" w:space="0" w:color="E3E3E4"/>
+              <w:left w:val="single" w:sz="4" w:space="0" w:color="E3E3E4"/>
+              <w:bottom w:val="single" w:sz="4" w:space="0" w:color="E3E3E4"/>
+              <w:right w:val="single" w:sz="4" w:space="0" w:color="E3E3E4"/>
+            </w:tcBorders>
+            <w:shd w:color="auto" w:fill="FFFFFF" w:val="clear"/>
+          </w:tcPr>
+          <w:p>
+            <w:pPr>
+              <w:pStyle w:val="Normal"/>
+              <w:spacing w:before="0" w:after="20"/>
+              <w:rPr/>
+            </w:pPr>
+            <w:r>
+              <w:rPr>
+                <w:rFonts w:eastAsia="Times New Roman" w:cs="Times New Roman"/>
+                <w:b w:val="false"/>
+                <w:bCs w:val="false"/>
+                <w:color w:val="58595B"/>
+                <w:sz w:val="19"/>
+                <w:szCs w:val="19"/>
+              </w:rPr>
+              <w:t>WHATSAPP_APP_SECRET</w:t>
+            </w:r>
+          </w:p>
+        </w:tc>
+        <w:tc>
+          <w:tcPr>
+            <w:tcW w:w="2401" w:type="dxa"/>
+            <w:tcBorders>
+              <w:top w:val="single" w:sz="4" w:space="0" w:color="E3E3E4"/>
+              <w:left w:val="single" w:sz="4" w:space="0" w:color="E3E3E4"/>
+              <w:bottom w:val="single" w:sz="4" w:space="0" w:color="E3E3E4"/>
+              <w:right w:val="single" w:sz="4" w:space="0" w:color="E3E3E4"/>
+            </w:tcBorders>
+            <w:shd w:color="auto" w:fill="FFFFFF" w:val="clear"/>
+          </w:tcPr>
+          <w:p>
+            <w:pPr>
+              <w:pStyle w:val="Normal"/>
+              <w:spacing w:before="0" w:after="20"/>
+              <w:rPr/>
+            </w:pPr>
+            <w:r>
+              <w:rPr>
+                <w:rFonts w:eastAsia="Times New Roman" w:cs="Times New Roman"/>
+                <w:b w:val="false"/>
+                <w:bCs w:val="false"/>
+                <w:color w:val="58595B"/>
+                <w:sz w:val="19"/>
+                <w:szCs w:val="19"/>
+              </w:rPr>
+              <w:t>—</w:t>
+            </w:r>
+          </w:p>
+        </w:tc>
+        <w:tc>
+          <w:tcPr>
+            <w:tcW w:w="4346" w:type="dxa"/>
+            <w:tcBorders>
+              <w:top w:val="single" w:sz="4" w:space="0" w:color="E3E3E4"/>
+              <w:left w:val="single" w:sz="4" w:space="0" w:color="E3E3E4"/>
+              <w:bottom w:val="single" w:sz="4" w:space="0" w:color="E3E3E4"/>
+              <w:right w:val="single" w:sz="4" w:space="0" w:color="E3E3E4"/>
+            </w:tcBorders>
+            <w:shd w:color="auto" w:fill="FFFFFF" w:val="clear"/>
+          </w:tcPr>
+          <w:p>
+            <w:pPr>
+              <w:pStyle w:val="Normal"/>
+              <w:spacing w:before="0" w:after="20"/>
+              <w:rPr/>
+            </w:pPr>
+            <w:r>
+              <w:rPr>
+                <w:rFonts w:eastAsia="Times New Roman" w:cs="Times New Roman"/>
+                <w:b w:val="false"/>
+                <w:bCs w:val="false"/>
+                <w:color w:val="58595B"/>
+                <w:sz w:val="19"/>
+                <w:szCs w:val="19"/>
+              </w:rPr>
+              <w:t>App secret used to check the signature of webhook calls</w:t>
+            </w:r>
+          </w:p>
+        </w:tc>
+      </w:tr>
+      <w:tr>
+        <w:trPr>
+          <w:cantSplit w:val="true"/>
+        </w:trPr>
+        <w:tc>
+          <w:tcPr>
+            <w:tcW w:w="2999" w:type="dxa"/>
+            <w:tcBorders>
+              <w:top w:val="single" w:sz="4" w:space="0" w:color="E3E3E4"/>
+              <w:left w:val="single" w:sz="4" w:space="0" w:color="E3E3E4"/>
+              <w:bottom w:val="single" w:sz="4" w:space="0" w:color="E3E3E4"/>
+              <w:right w:val="single" w:sz="4" w:space="0" w:color="E3E3E4"/>
+            </w:tcBorders>
+            <w:shd w:color="auto" w:fill="F2F2F3" w:val="clear"/>
+          </w:tcPr>
+          <w:p>
+            <w:pPr>
+              <w:pStyle w:val="Normal"/>
+              <w:spacing w:before="0" w:after="20"/>
+              <w:rPr/>
+            </w:pPr>
+            <w:r>
+              <w:rPr>
+                <w:rFonts w:eastAsia="Times New Roman" w:cs="Times New Roman"/>
+                <w:b w:val="false"/>
+                <w:bCs w:val="false"/>
+                <w:color w:val="58595B"/>
+                <w:sz w:val="19"/>
+                <w:szCs w:val="19"/>
+              </w:rPr>
+              <w:t>WHATSAPP_API_BASE</w:t>
+            </w:r>
+          </w:p>
+        </w:tc>
+        <w:tc>
+          <w:tcPr>
+            <w:tcW w:w="2401" w:type="dxa"/>
+            <w:tcBorders>
+              <w:top w:val="single" w:sz="4" w:space="0" w:color="E3E3E4"/>
+              <w:left w:val="single" w:sz="4" w:space="0" w:color="E3E3E4"/>
+              <w:bottom w:val="single" w:sz="4" w:space="0" w:color="E3E3E4"/>
+              <w:right w:val="single" w:sz="4" w:space="0" w:color="E3E3E4"/>
+            </w:tcBorders>
+            <w:shd w:color="auto" w:fill="F2F2F3" w:val="clear"/>
+          </w:tcPr>
+          <w:p>
+            <w:pPr>
+              <w:pStyle w:val="Normal"/>
+              <w:spacing w:before="0" w:after="20"/>
+              <w:rPr/>
+            </w:pPr>
+            <w:r>
+              <w:rPr>
+                <w:rFonts w:eastAsia="Times New Roman" w:cs="Times New Roman"/>
+                <w:b w:val="false"/>
+                <w:bCs w:val="false"/>
+                <w:color w:val="58595B"/>
+                <w:sz w:val="19"/>
+                <w:szCs w:val="19"/>
+              </w:rPr>
+              <w:t>https://graph.facebook.com/v21.0</w:t>
+            </w:r>
+          </w:p>
+        </w:tc>
+        <w:tc>
+          <w:tcPr>
+            <w:tcW w:w="4346" w:type="dxa"/>
+            <w:tcBorders>
+              <w:top w:val="single" w:sz="4" w:space="0" w:color="E3E3E4"/>
+              <w:left w:val="single" w:sz="4" w:space="0" w:color="E3E3E4"/>
+              <w:bottom w:val="single" w:sz="4" w:space="0" w:color="E3E3E4"/>
+              <w:right w:val="single" w:sz="4" w:space="0" w:color="E3E3E4"/>
+            </w:tcBorders>
+            <w:shd w:color="auto" w:fill="F2F2F3" w:val="clear"/>
+          </w:tcPr>
+          <w:p>
+            <w:pPr>
+              <w:pStyle w:val="Normal"/>
+              <w:spacing w:before="0" w:after="20"/>
+              <w:rPr/>
+            </w:pPr>
+            <w:r>
+              <w:rPr>
+                <w:rFonts w:eastAsia="Times New Roman" w:cs="Times New Roman"/>
+                <w:b w:val="false"/>
+                <w:bCs w:val="false"/>
+                <w:color w:val="58595B"/>
+                <w:sz w:val="19"/>
+                <w:szCs w:val="19"/>
+              </w:rPr>
+              <w:t>Cloud API address</w:t>
+            </w:r>
+          </w:p>
+        </w:tc>
+      </w:tr>
+    </w:tbl>
+    <w:p>
+      <w:pPr>
+        <w:pStyle w:val="Normal"/>
+        <w:spacing w:lineRule="auto" w:line="276" w:before="0" w:after="120"/>
+        <w:jc w:val="both"/>
+        <w:rPr/>
+      </w:pPr>
+      <w:r>
+        <w:rPr>
+          <w:rFonts w:eastAsia="Times New Roman" w:cs="Times New Roman"/>
+          <w:color w:val="58595B"/>
+          <w:sz w:val="24"/>
+          <w:szCs w:val="24"/>
+        </w:rPr>
+        <w:t>Declare the webhook &lt;PUBLIC_URL&gt;/api/public/whatsapp/webhook in Meta so delivery statuses (sent, delivered, read, failed) and replies come back. The server retries failed messages every minute and plays due reminders every 10 minutes.</w:t>
+      </w:r>
+      <w:r>
+        <w:br w:type="page"/>
+      </w:r>
+    </w:p>
+    <w:p>
+      <w:pPr>
         <w:pStyle w:val="Heading1"/>
         <w:pBdr>
           <w:bottom w:val="single" w:sz="8" w:space="4" w:color="F8931D"/>
@@ -4490,11 +5834,8 @@
         <w:spacing w:before="0" w:after="200"/>
         <w:rPr/>
       </w:pPr>
-      <w:r>
-        <w:br w:type="page"/>
-      </w:r>
-      <w:bookmarkStart w:id="15" w:name="__RefHeading___Toc421_2738309569"/>
-      <w:bookmarkEnd w:id="15"/>
+      <w:bookmarkStart w:id="16" w:name="__RefHeading___Toc545_2622541029"/>
+      <w:bookmarkEnd w:id="16"/>
       <w:r>
         <w:rPr>
           <w:rFonts w:eastAsia="Times New Roman" w:cs="Times New Roman"/>
@@ -5184,7 +6525,7 @@
     </w:r>
     <w:r>
       <w:rPr/>
-      <w:t>12</w:t>
+      <w:t>13</w:t>
     </w:r>
     <w:r>
       <w:rPr/>
@@ -5213,7 +6554,7 @@
     </w:r>
     <w:r>
       <w:rPr/>
-      <w:t>12</w:t>
+      <w:t>13</w:t>
     </w:r>
     <w:r>
       <w:rPr/>

</xml_diff>

<commit_message>
CortexSkills v1.10 deliverables: user guides EN/FR (five complete runs), admin guides EN/FR, installation guide, conformance report, sample document packs; deck and checklist builders
Co-Authored-By: Claude Opus 5.5 <noreply@anthropic.com>
Claude-Session: https://claude.ai/code/session_01CPoP9gXznxAoCuDQx1kksH
</commit_message>
<xml_diff>
--- a/cortexskills/deliverables/CortexSkills_Installation_Guide.docx
+++ b/cortexskills/deliverables/CortexSkills_Installation_Guide.docx
@@ -190,7 +190,7 @@
           <w:sz w:val="20"/>
           <w:szCs w:val="20"/>
         </w:rPr>
-        <w:t>Version 1.1.0 · 2026-10-05</w:t>
+        <w:t>Version 1.10.0 · 2026-10-06</w:t>
       </w:r>
     </w:p>
     <w:p>
@@ -275,7 +275,7 @@
             </w:rPr>
             <w:fldChar w:fldCharType="separate"/>
           </w:r>
-          <w:hyperlink w:anchor="__RefHeading___Toc513_2622541029">
+          <w:hyperlink w:anchor="__RefHeading___Toc513_2383020485">
             <w:r>
               <w:rPr>
                 <w:rStyle w:val="IndexLink"/>
@@ -295,7 +295,7 @@
             </w:tabs>
             <w:rPr/>
           </w:pPr>
-          <w:hyperlink w:anchor="__RefHeading___Toc515_2622541029">
+          <w:hyperlink w:anchor="__RefHeading___Toc515_2383020485">
             <w:r>
               <w:rPr>
                 <w:rStyle w:val="IndexLink"/>
@@ -315,7 +315,7 @@
             </w:tabs>
             <w:rPr/>
           </w:pPr>
-          <w:hyperlink w:anchor="__RefHeading___Toc517_2622541029">
+          <w:hyperlink w:anchor="__RefHeading___Toc517_2383020485">
             <w:r>
               <w:rPr>
                 <w:rStyle w:val="IndexLink"/>
@@ -335,7 +335,7 @@
             </w:tabs>
             <w:rPr/>
           </w:pPr>
-          <w:hyperlink w:anchor="__RefHeading___Toc519_2622541029">
+          <w:hyperlink w:anchor="__RefHeading___Toc519_2383020485">
             <w:r>
               <w:rPr>
                 <w:rStyle w:val="IndexLink"/>
@@ -355,7 +355,7 @@
             </w:tabs>
             <w:rPr/>
           </w:pPr>
-          <w:hyperlink w:anchor="__RefHeading___Toc521_2622541029">
+          <w:hyperlink w:anchor="__RefHeading___Toc521_2383020485">
             <w:r>
               <w:rPr>
                 <w:rStyle w:val="IndexLink"/>
@@ -375,7 +375,7 @@
             </w:tabs>
             <w:rPr/>
           </w:pPr>
-          <w:hyperlink w:anchor="__RefHeading___Toc523_2622541029">
+          <w:hyperlink w:anchor="__RefHeading___Toc523_2383020485">
             <w:r>
               <w:rPr>
                 <w:rStyle w:val="IndexLink"/>
@@ -395,7 +395,7 @@
             </w:tabs>
             <w:rPr/>
           </w:pPr>
-          <w:hyperlink w:anchor="__RefHeading___Toc525_2622541029">
+          <w:hyperlink w:anchor="__RefHeading___Toc525_2383020485">
             <w:r>
               <w:rPr>
                 <w:rStyle w:val="IndexLink"/>
@@ -415,7 +415,7 @@
             </w:tabs>
             <w:rPr/>
           </w:pPr>
-          <w:hyperlink w:anchor="__RefHeading___Toc527_2622541029">
+          <w:hyperlink w:anchor="__RefHeading___Toc527_2383020485">
             <w:r>
               <w:rPr>
                 <w:rStyle w:val="IndexLink"/>
@@ -435,7 +435,7 @@
             </w:tabs>
             <w:rPr/>
           </w:pPr>
-          <w:hyperlink w:anchor="__RefHeading___Toc529_2622541029">
+          <w:hyperlink w:anchor="__RefHeading___Toc529_2383020485">
             <w:r>
               <w:rPr>
                 <w:rStyle w:val="IndexLink"/>
@@ -455,7 +455,7 @@
             </w:tabs>
             <w:rPr/>
           </w:pPr>
-          <w:hyperlink w:anchor="__RefHeading___Toc531_2622541029">
+          <w:hyperlink w:anchor="__RefHeading___Toc531_2383020485">
             <w:r>
               <w:rPr>
                 <w:rStyle w:val="IndexLink"/>
@@ -475,7 +475,7 @@
             </w:tabs>
             <w:rPr/>
           </w:pPr>
-          <w:hyperlink w:anchor="__RefHeading___Toc533_2622541029">
+          <w:hyperlink w:anchor="__RefHeading___Toc533_2383020485">
             <w:r>
               <w:rPr>
                 <w:rStyle w:val="IndexLink"/>
@@ -495,7 +495,7 @@
             </w:tabs>
             <w:rPr/>
           </w:pPr>
-          <w:hyperlink w:anchor="__RefHeading___Toc535_2622541029">
+          <w:hyperlink w:anchor="__RefHeading___Toc535_2383020485">
             <w:r>
               <w:rPr>
                 <w:rStyle w:val="IndexLink"/>
@@ -515,7 +515,7 @@
             </w:tabs>
             <w:rPr/>
           </w:pPr>
-          <w:hyperlink w:anchor="__RefHeading___Toc537_2622541029">
+          <w:hyperlink w:anchor="__RefHeading___Toc537_2383020485">
             <w:r>
               <w:rPr>
                 <w:rStyle w:val="IndexLink"/>
@@ -535,7 +535,7 @@
             </w:tabs>
             <w:rPr/>
           </w:pPr>
-          <w:hyperlink w:anchor="__RefHeading___Toc539_2622541029">
+          <w:hyperlink w:anchor="__RefHeading___Toc539_2383020485">
             <w:r>
               <w:rPr>
                 <w:rStyle w:val="IndexLink"/>
@@ -555,7 +555,7 @@
             </w:tabs>
             <w:rPr/>
           </w:pPr>
-          <w:hyperlink w:anchor="__RefHeading___Toc541_2622541029">
+          <w:hyperlink w:anchor="__RefHeading___Toc541_2383020485">
             <w:r>
               <w:rPr>
                 <w:rStyle w:val="IndexLink"/>
@@ -575,7 +575,7 @@
             </w:tabs>
             <w:rPr/>
           </w:pPr>
-          <w:hyperlink w:anchor="__RefHeading___Toc543_2622541029">
+          <w:hyperlink w:anchor="__RefHeading___Toc543_2383020485">
             <w:r>
               <w:rPr>
                 <w:rStyle w:val="IndexLink"/>
@@ -595,7 +595,7 @@
             </w:tabs>
             <w:rPr/>
           </w:pPr>
-          <w:hyperlink w:anchor="__RefHeading___Toc545_2622541029">
+          <w:hyperlink w:anchor="__RefHeading___Toc545_2383020485">
             <w:r>
               <w:rPr>
                 <w:rStyle w:val="IndexLink"/>
@@ -639,7 +639,7 @@
         <w:spacing w:before="0" w:after="200"/>
         <w:rPr/>
       </w:pPr>
-      <w:bookmarkStart w:id="0" w:name="__RefHeading___Toc513_2622541029"/>
+      <w:bookmarkStart w:id="0" w:name="__RefHeading___Toc513_2383020485"/>
       <w:bookmarkEnd w:id="0"/>
       <w:r>
         <w:rPr>
@@ -1008,7 +1008,7 @@
                 <w:sz w:val="19"/>
                 <w:szCs w:val="19"/>
               </w:rPr>
-              <w:t>58 organizations in 29 sectors, each with two full runs (Digital skills and AI skills), in English, French and Arabic.</w:t>
+              <w:t>59 organizations: a large company and an SME in each of 29 sectors, plus a multi-sector services group; each has two full runs (Digital skills and AI skills) with every process, task and step, in English, French and Arabic.</w:t>
             </w:r>
           </w:p>
         </w:tc>
@@ -1085,7 +1085,7 @@
                 <w:sz w:val="22"/>
                 <w:szCs w:val="22"/>
               </w:rPr>
-              <w:t>About 15 minutes the first time: 5 minutes to install Node.js, 5 minutes for the two installs, 1 minute for the demonstration data.</w:t>
+              <w:t>About 15 minutes the first time: 5 minutes to install Node.js, 5 minutes for the two installs, 2 minutes for the demonstration data. Keep 2 GB of free disk space: the demonstration database takes about 450 MB.</w:t>
             </w:r>
           </w:p>
         </w:tc>
@@ -1103,7 +1103,7 @@
       <w:r>
         <w:br w:type="page"/>
       </w:r>
-      <w:bookmarkStart w:id="1" w:name="__RefHeading___Toc515_2622541029"/>
+      <w:bookmarkStart w:id="1" w:name="__RefHeading___Toc515_2383020485"/>
       <w:bookmarkEnd w:id="1"/>
       <w:r>
         <w:rPr>
@@ -1124,7 +1124,7 @@
         <w:spacing w:before="280" w:after="120"/>
         <w:rPr/>
       </w:pPr>
-      <w:bookmarkStart w:id="2" w:name="__RefHeading___Toc517_2622541029"/>
+      <w:bookmarkStart w:id="2" w:name="__RefHeading___Toc517_2383020485"/>
       <w:bookmarkEnd w:id="2"/>
       <w:r>
         <w:rPr>
@@ -1225,7 +1225,7 @@
         <w:spacing w:before="280" w:after="120"/>
         <w:rPr/>
       </w:pPr>
-      <w:bookmarkStart w:id="3" w:name="__RefHeading___Toc519_2622541029"/>
+      <w:bookmarkStart w:id="3" w:name="__RefHeading___Toc519_2383020485"/>
       <w:bookmarkEnd w:id="3"/>
       <w:r>
         <w:rPr>
@@ -1263,7 +1263,7 @@
         <w:spacing w:before="280" w:after="120"/>
         <w:rPr/>
       </w:pPr>
-      <w:bookmarkStart w:id="4" w:name="__RefHeading___Toc521_2622541029"/>
+      <w:bookmarkStart w:id="4" w:name="__RefHeading___Toc521_2383020485"/>
       <w:bookmarkEnd w:id="4"/>
       <w:r>
         <w:rPr>
@@ -1341,7 +1341,7 @@
         <w:spacing w:before="0" w:after="200"/>
         <w:rPr/>
       </w:pPr>
-      <w:bookmarkStart w:id="5" w:name="__RefHeading___Toc523_2622541029"/>
+      <w:bookmarkStart w:id="5" w:name="__RefHeading___Toc523_2383020485"/>
       <w:bookmarkEnd w:id="5"/>
       <w:r>
         <w:rPr>
@@ -1494,7 +1494,7 @@
       <w:r>
         <w:br w:type="page"/>
       </w:r>
-      <w:bookmarkStart w:id="6" w:name="__RefHeading___Toc525_2622541029"/>
+      <w:bookmarkStart w:id="6" w:name="__RefHeading___Toc525_2383020485"/>
       <w:bookmarkEnd w:id="6"/>
       <w:r>
         <w:rPr>
@@ -1958,7 +1958,7 @@
                 <w:sz w:val="19"/>
                 <w:szCs w:val="19"/>
               </w:rPr>
-              <w:t>About 1 minute</w:t>
+              <w:t>About 2 minutes</w:t>
             </w:r>
           </w:p>
         </w:tc>
@@ -2134,7 +2134,7 @@
         <w:spacing w:before="0" w:after="200"/>
         <w:rPr/>
       </w:pPr>
-      <w:bookmarkStart w:id="7" w:name="__RefHeading___Toc527_2622541029"/>
+      <w:bookmarkStart w:id="7" w:name="__RefHeading___Toc527_2383020485"/>
       <w:bookmarkEnd w:id="7"/>
       <w:r>
         <w:rPr>
@@ -2341,7 +2341,7 @@
         <w:spacing w:before="0" w:after="200"/>
         <w:rPr/>
       </w:pPr>
-      <w:bookmarkStart w:id="8" w:name="__RefHeading___Toc529_2622541029"/>
+      <w:bookmarkStart w:id="8" w:name="__RefHeading___Toc529_2383020485"/>
       <w:bookmarkEnd w:id="8"/>
       <w:r>
         <w:rPr>
@@ -3086,7 +3086,7 @@
         <w:spacing w:before="0" w:after="200"/>
         <w:rPr/>
       </w:pPr>
-      <w:bookmarkStart w:id="9" w:name="__RefHeading___Toc531_2622541029"/>
+      <w:bookmarkStart w:id="9" w:name="__RefHeading___Toc531_2383020485"/>
       <w:bookmarkEnd w:id="9"/>
       <w:r>
         <w:rPr>
@@ -3521,7 +3521,7 @@
       <w:r>
         <w:br w:type="page"/>
       </w:r>
-      <w:bookmarkStart w:id="10" w:name="__RefHeading___Toc533_2622541029"/>
+      <w:bookmarkStart w:id="10" w:name="__RefHeading___Toc533_2383020485"/>
       <w:bookmarkEnd w:id="10"/>
       <w:r>
         <w:rPr>
@@ -3542,7 +3542,7 @@
         <w:spacing w:before="280" w:after="120"/>
         <w:rPr/>
       </w:pPr>
-      <w:bookmarkStart w:id="11" w:name="__RefHeading___Toc535_2622541029"/>
+      <w:bookmarkStart w:id="11" w:name="__RefHeading___Toc535_2383020485"/>
       <w:bookmarkEnd w:id="11"/>
       <w:r>
         <w:rPr>
@@ -3580,7 +3580,7 @@
         <w:spacing w:before="280" w:after="120"/>
         <w:rPr/>
       </w:pPr>
-      <w:bookmarkStart w:id="12" w:name="__RefHeading___Toc537_2622541029"/>
+      <w:bookmarkStart w:id="12" w:name="__RefHeading___Toc537_2383020485"/>
       <w:bookmarkEnd w:id="12"/>
       <w:r>
         <w:rPr>
@@ -3653,7 +3653,7 @@
         <w:spacing w:before="280" w:after="120"/>
         <w:rPr/>
       </w:pPr>
-      <w:bookmarkStart w:id="13" w:name="__RefHeading___Toc539_2622541029"/>
+      <w:bookmarkStart w:id="13" w:name="__RefHeading___Toc539_2383020485"/>
       <w:bookmarkEnd w:id="13"/>
       <w:r>
         <w:rPr>
@@ -3696,7 +3696,7 @@
         <w:spacing w:before="0" w:after="200"/>
         <w:rPr/>
       </w:pPr>
-      <w:bookmarkStart w:id="14" w:name="__RefHeading___Toc541_2622541029"/>
+      <w:bookmarkStart w:id="14" w:name="__RefHeading___Toc541_2383020485"/>
       <w:bookmarkEnd w:id="14"/>
       <w:r>
         <w:rPr>
@@ -4508,7 +4508,7 @@
         <w:spacing w:before="280" w:after="120"/>
         <w:rPr/>
       </w:pPr>
-      <w:bookmarkStart w:id="15" w:name="__RefHeading___Toc543_2622541029"/>
+      <w:bookmarkStart w:id="15" w:name="__RefHeading___Toc543_2383020485"/>
       <w:bookmarkEnd w:id="15"/>
       <w:r>
         <w:rPr>
@@ -5834,7 +5834,7 @@
         <w:spacing w:before="0" w:after="200"/>
         <w:rPr/>
       </w:pPr>
-      <w:bookmarkStart w:id="16" w:name="__RefHeading___Toc545_2622541029"/>
+      <w:bookmarkStart w:id="16" w:name="__RefHeading___Toc545_2383020485"/>
       <w:bookmarkEnd w:id="16"/>
       <w:r>
         <w:rPr>

</xml_diff>

<commit_message>
Translated respondent answers, backup clean-up, install notes
- Seeded questionnaire answers kept in English, French and Arabic (same choices), so the
  Training Engineering Report quotes them in the language of the document.
- Function names of responses shown in the document language.
- The seed removes the backup files of the previous demonstration data, and the backup purge
  removes files no longer listed: repeated seeds no longer fill the disk.
- Thousands separators render in the embedded fonts; trainer types translated; headings kept
  with their table.
- README and installation guide: complete examples, seed time, disk space, troubleshooting.

Co-Authored-By: Claude Opus 5.5 <noreply@anthropic.com>
Claude-Session: https://claude.ai/code/session_01CPoP9gXznxAoCuDQx1kksH
</commit_message>
<xml_diff>
--- a/cortexskills/deliverables/CortexSkills_Installation_Guide.docx
+++ b/cortexskills/deliverables/CortexSkills_Installation_Guide.docx
@@ -275,7 +275,7 @@
             </w:rPr>
             <w:fldChar w:fldCharType="separate"/>
           </w:r>
-          <w:hyperlink w:anchor="__RefHeading___Toc164451_2904896170">
+          <w:hyperlink w:anchor="__RefHeading___Toc519_2930978808">
             <w:r>
               <w:rPr>
                 <w:rStyle w:val="IndexLink"/>
@@ -295,7 +295,7 @@
             </w:tabs>
             <w:rPr/>
           </w:pPr>
-          <w:hyperlink w:anchor="__RefHeading___Toc164453_2904896170">
+          <w:hyperlink w:anchor="__RefHeading___Toc521_2930978808">
             <w:r>
               <w:rPr>
                 <w:rStyle w:val="IndexLink"/>
@@ -315,7 +315,7 @@
             </w:tabs>
             <w:rPr/>
           </w:pPr>
-          <w:hyperlink w:anchor="__RefHeading___Toc164455_2904896170">
+          <w:hyperlink w:anchor="__RefHeading___Toc523_2930978808">
             <w:r>
               <w:rPr>
                 <w:rStyle w:val="IndexLink"/>
@@ -335,7 +335,7 @@
             </w:tabs>
             <w:rPr/>
           </w:pPr>
-          <w:hyperlink w:anchor="__RefHeading___Toc164457_2904896170">
+          <w:hyperlink w:anchor="__RefHeading___Toc525_2930978808">
             <w:r>
               <w:rPr>
                 <w:rStyle w:val="IndexLink"/>
@@ -355,7 +355,7 @@
             </w:tabs>
             <w:rPr/>
           </w:pPr>
-          <w:hyperlink w:anchor="__RefHeading___Toc164459_2904896170">
+          <w:hyperlink w:anchor="__RefHeading___Toc527_2930978808">
             <w:r>
               <w:rPr>
                 <w:rStyle w:val="IndexLink"/>
@@ -375,7 +375,7 @@
             </w:tabs>
             <w:rPr/>
           </w:pPr>
-          <w:hyperlink w:anchor="__RefHeading___Toc164461_2904896170">
+          <w:hyperlink w:anchor="__RefHeading___Toc529_2930978808">
             <w:r>
               <w:rPr>
                 <w:rStyle w:val="IndexLink"/>
@@ -395,7 +395,7 @@
             </w:tabs>
             <w:rPr/>
           </w:pPr>
-          <w:hyperlink w:anchor="__RefHeading___Toc164463_2904896170">
+          <w:hyperlink w:anchor="__RefHeading___Toc531_2930978808">
             <w:r>
               <w:rPr>
                 <w:rStyle w:val="IndexLink"/>
@@ -415,7 +415,7 @@
             </w:tabs>
             <w:rPr/>
           </w:pPr>
-          <w:hyperlink w:anchor="__RefHeading___Toc164465_2904896170">
+          <w:hyperlink w:anchor="__RefHeading___Toc533_2930978808">
             <w:r>
               <w:rPr>
                 <w:rStyle w:val="IndexLink"/>
@@ -435,7 +435,7 @@
             </w:tabs>
             <w:rPr/>
           </w:pPr>
-          <w:hyperlink w:anchor="__RefHeading___Toc164467_2904896170">
+          <w:hyperlink w:anchor="__RefHeading___Toc535_2930978808">
             <w:r>
               <w:rPr>
                 <w:rStyle w:val="IndexLink"/>
@@ -455,7 +455,7 @@
             </w:tabs>
             <w:rPr/>
           </w:pPr>
-          <w:hyperlink w:anchor="__RefHeading___Toc164469_2904896170">
+          <w:hyperlink w:anchor="__RefHeading___Toc537_2930978808">
             <w:r>
               <w:rPr>
                 <w:rStyle w:val="IndexLink"/>
@@ -475,7 +475,7 @@
             </w:tabs>
             <w:rPr/>
           </w:pPr>
-          <w:hyperlink w:anchor="__RefHeading___Toc164471_2904896170">
+          <w:hyperlink w:anchor="__RefHeading___Toc539_2930978808">
             <w:r>
               <w:rPr>
                 <w:rStyle w:val="IndexLink"/>
@@ -495,7 +495,7 @@
             </w:tabs>
             <w:rPr/>
           </w:pPr>
-          <w:hyperlink w:anchor="__RefHeading___Toc164473_2904896170">
+          <w:hyperlink w:anchor="__RefHeading___Toc541_2930978808">
             <w:r>
               <w:rPr>
                 <w:rStyle w:val="IndexLink"/>
@@ -515,7 +515,7 @@
             </w:tabs>
             <w:rPr/>
           </w:pPr>
-          <w:hyperlink w:anchor="__RefHeading___Toc164475_2904896170">
+          <w:hyperlink w:anchor="__RefHeading___Toc543_2930978808">
             <w:r>
               <w:rPr>
                 <w:rStyle w:val="IndexLink"/>
@@ -535,7 +535,7 @@
             </w:tabs>
             <w:rPr/>
           </w:pPr>
-          <w:hyperlink w:anchor="__RefHeading___Toc164477_2904896170">
+          <w:hyperlink w:anchor="__RefHeading___Toc545_2930978808">
             <w:r>
               <w:rPr>
                 <w:rStyle w:val="IndexLink"/>
@@ -555,7 +555,7 @@
             </w:tabs>
             <w:rPr/>
           </w:pPr>
-          <w:hyperlink w:anchor="__RefHeading___Toc164479_2904896170">
+          <w:hyperlink w:anchor="__RefHeading___Toc547_2930978808">
             <w:r>
               <w:rPr>
                 <w:rStyle w:val="IndexLink"/>
@@ -575,7 +575,7 @@
             </w:tabs>
             <w:rPr/>
           </w:pPr>
-          <w:hyperlink w:anchor="__RefHeading___Toc164481_2904896170">
+          <w:hyperlink w:anchor="__RefHeading___Toc549_2930978808">
             <w:r>
               <w:rPr>
                 <w:rStyle w:val="IndexLink"/>
@@ -595,7 +595,7 @@
             </w:tabs>
             <w:rPr/>
           </w:pPr>
-          <w:hyperlink w:anchor="__RefHeading___Toc164483_2904896170">
+          <w:hyperlink w:anchor="__RefHeading___Toc551_2930978808">
             <w:r>
               <w:rPr>
                 <w:rStyle w:val="IndexLink"/>
@@ -639,7 +639,7 @@
         <w:spacing w:before="0" w:after="200"/>
         <w:rPr/>
       </w:pPr>
-      <w:bookmarkStart w:id="0" w:name="__RefHeading___Toc164451_2904896170"/>
+      <w:bookmarkStart w:id="0" w:name="__RefHeading___Toc519_2930978808"/>
       <w:bookmarkEnd w:id="0"/>
       <w:r>
         <w:rPr>
@@ -1085,7 +1085,7 @@
                 <w:sz w:val="22"/>
                 <w:szCs w:val="22"/>
               </w:rPr>
-              <w:t>About 15 minutes the first time: 5 minutes to install Node.js, 5 minutes for the two installs, 2 minutes for the demonstration data. Keep 2 GB of free disk space: the demonstration database takes about 450 MB.</w:t>
+              <w:t>About 15 minutes the first time: 5 minutes to install Node.js, 5 minutes for the two installs, 4 minutes for the demonstration data. Keep 3 GB of free disk space: the demonstration database takes about 850 MB and the seed keeps one backup copy of it.</w:t>
             </w:r>
           </w:p>
         </w:tc>
@@ -1103,7 +1103,7 @@
       <w:r>
         <w:br w:type="page"/>
       </w:r>
-      <w:bookmarkStart w:id="1" w:name="__RefHeading___Toc164453_2904896170"/>
+      <w:bookmarkStart w:id="1" w:name="__RefHeading___Toc521_2930978808"/>
       <w:bookmarkEnd w:id="1"/>
       <w:r>
         <w:rPr>
@@ -1124,7 +1124,7 @@
         <w:spacing w:before="280" w:after="120"/>
         <w:rPr/>
       </w:pPr>
-      <w:bookmarkStart w:id="2" w:name="__RefHeading___Toc164455_2904896170"/>
+      <w:bookmarkStart w:id="2" w:name="__RefHeading___Toc523_2930978808"/>
       <w:bookmarkEnd w:id="2"/>
       <w:r>
         <w:rPr>
@@ -1225,7 +1225,7 @@
         <w:spacing w:before="280" w:after="120"/>
         <w:rPr/>
       </w:pPr>
-      <w:bookmarkStart w:id="3" w:name="__RefHeading___Toc164457_2904896170"/>
+      <w:bookmarkStart w:id="3" w:name="__RefHeading___Toc525_2930978808"/>
       <w:bookmarkEnd w:id="3"/>
       <w:r>
         <w:rPr>
@@ -1263,7 +1263,7 @@
         <w:spacing w:before="280" w:after="120"/>
         <w:rPr/>
       </w:pPr>
-      <w:bookmarkStart w:id="4" w:name="__RefHeading___Toc164459_2904896170"/>
+      <w:bookmarkStart w:id="4" w:name="__RefHeading___Toc527_2930978808"/>
       <w:bookmarkEnd w:id="4"/>
       <w:r>
         <w:rPr>
@@ -1341,7 +1341,7 @@
         <w:spacing w:before="0" w:after="200"/>
         <w:rPr/>
       </w:pPr>
-      <w:bookmarkStart w:id="5" w:name="__RefHeading___Toc164461_2904896170"/>
+      <w:bookmarkStart w:id="5" w:name="__RefHeading___Toc529_2930978808"/>
       <w:bookmarkEnd w:id="5"/>
       <w:r>
         <w:rPr>
@@ -1494,7 +1494,7 @@
       <w:r>
         <w:br w:type="page"/>
       </w:r>
-      <w:bookmarkStart w:id="6" w:name="__RefHeading___Toc164463_2904896170"/>
+      <w:bookmarkStart w:id="6" w:name="__RefHeading___Toc531_2930978808"/>
       <w:bookmarkEnd w:id="6"/>
       <w:r>
         <w:rPr>
@@ -1928,7 +1928,7 @@
                 <w:sz w:val="19"/>
                 <w:szCs w:val="19"/>
               </w:rPr>
-              <w:t>Creates the demonstration data. It erases any existing data, so run it only the first time or when you want a fresh start.</w:t>
+              <w:t>Creates the demonstration data. It erases any existing data and its old backups, so run it only the first time or when you want a fresh start.</w:t>
             </w:r>
           </w:p>
         </w:tc>
@@ -1958,7 +1958,7 @@
                 <w:sz w:val="19"/>
                 <w:szCs w:val="19"/>
               </w:rPr>
-              <w:t>About 2 minutes</w:t>
+              <w:t>About 4 minutes</w:t>
             </w:r>
           </w:p>
         </w:tc>
@@ -2134,7 +2134,7 @@
         <w:spacing w:before="0" w:after="200"/>
         <w:rPr/>
       </w:pPr>
-      <w:bookmarkStart w:id="7" w:name="__RefHeading___Toc164465_2904896170"/>
+      <w:bookmarkStart w:id="7" w:name="__RefHeading___Toc533_2930978808"/>
       <w:bookmarkEnd w:id="7"/>
       <w:r>
         <w:rPr>
@@ -2341,7 +2341,7 @@
         <w:spacing w:before="0" w:after="200"/>
         <w:rPr/>
       </w:pPr>
-      <w:bookmarkStart w:id="8" w:name="__RefHeading___Toc164467_2904896170"/>
+      <w:bookmarkStart w:id="8" w:name="__RefHeading___Toc535_2930978808"/>
       <w:bookmarkEnd w:id="8"/>
       <w:r>
         <w:rPr>
@@ -3086,7 +3086,7 @@
         <w:spacing w:before="0" w:after="200"/>
         <w:rPr/>
       </w:pPr>
-      <w:bookmarkStart w:id="9" w:name="__RefHeading___Toc164469_2904896170"/>
+      <w:bookmarkStart w:id="9" w:name="__RefHeading___Toc537_2930978808"/>
       <w:bookmarkEnd w:id="9"/>
       <w:r>
         <w:rPr>
@@ -3521,7 +3521,7 @@
       <w:r>
         <w:br w:type="page"/>
       </w:r>
-      <w:bookmarkStart w:id="10" w:name="__RefHeading___Toc164471_2904896170"/>
+      <w:bookmarkStart w:id="10" w:name="__RefHeading___Toc539_2930978808"/>
       <w:bookmarkEnd w:id="10"/>
       <w:r>
         <w:rPr>
@@ -3542,7 +3542,7 @@
         <w:spacing w:before="280" w:after="120"/>
         <w:rPr/>
       </w:pPr>
-      <w:bookmarkStart w:id="11" w:name="__RefHeading___Toc164473_2904896170"/>
+      <w:bookmarkStart w:id="11" w:name="__RefHeading___Toc541_2930978808"/>
       <w:bookmarkEnd w:id="11"/>
       <w:r>
         <w:rPr>
@@ -3580,7 +3580,7 @@
         <w:spacing w:before="280" w:after="120"/>
         <w:rPr/>
       </w:pPr>
-      <w:bookmarkStart w:id="12" w:name="__RefHeading___Toc164475_2904896170"/>
+      <w:bookmarkStart w:id="12" w:name="__RefHeading___Toc543_2930978808"/>
       <w:bookmarkEnd w:id="12"/>
       <w:r>
         <w:rPr>
@@ -3653,7 +3653,7 @@
         <w:spacing w:before="280" w:after="120"/>
         <w:rPr/>
       </w:pPr>
-      <w:bookmarkStart w:id="13" w:name="__RefHeading___Toc164477_2904896170"/>
+      <w:bookmarkStart w:id="13" w:name="__RefHeading___Toc545_2930978808"/>
       <w:bookmarkEnd w:id="13"/>
       <w:r>
         <w:rPr>
@@ -3696,7 +3696,7 @@
         <w:spacing w:before="0" w:after="200"/>
         <w:rPr/>
       </w:pPr>
-      <w:bookmarkStart w:id="14" w:name="__RefHeading___Toc164479_2904896170"/>
+      <w:bookmarkStart w:id="14" w:name="__RefHeading___Toc547_2930978808"/>
       <w:bookmarkEnd w:id="14"/>
       <w:r>
         <w:rPr>
@@ -4508,7 +4508,7 @@
         <w:spacing w:before="280" w:after="120"/>
         <w:rPr/>
       </w:pPr>
-      <w:bookmarkStart w:id="15" w:name="__RefHeading___Toc164481_2904896170"/>
+      <w:bookmarkStart w:id="15" w:name="__RefHeading___Toc549_2930978808"/>
       <w:bookmarkEnd w:id="15"/>
       <w:r>
         <w:rPr>
@@ -5834,7 +5834,7 @@
         <w:spacing w:before="0" w:after="200"/>
         <w:rPr/>
       </w:pPr>
-      <w:bookmarkStart w:id="16" w:name="__RefHeading___Toc164483_2904896170"/>
+      <w:bookmarkStart w:id="16" w:name="__RefHeading___Toc551_2930978808"/>
       <w:bookmarkEnd w:id="16"/>
       <w:r>
         <w:rPr>
@@ -6200,7 +6200,7 @@
                 <w:sz w:val="19"/>
                 <w:szCs w:val="19"/>
               </w:rPr>
-              <w:t>npm is not recognized” / “command not found”</w:t>
+              <w:t>The seed stopped” (npm run seed)</w:t>
             </w:r>
           </w:p>
         </w:tc>
@@ -6230,7 +6230,7 @@
                 <w:sz w:val="19"/>
                 <w:szCs w:val="19"/>
               </w:rPr>
-              <w:t>Node.js is not installed or the window was opened before the installation. Install Node.js, then open a new window.</w:t>
+              <w:t>Stop the server first (close the window that runs npm run dev), check that 3 GB of disk space is free, and exclude the server\data folder from antivirus scanning and from OneDrive synchronization; then run npm run seed again. The message names the cause.</w:t>
             </w:r>
           </w:p>
         </w:tc>
@@ -6265,7 +6265,18 @@
                 <w:sz w:val="19"/>
                 <w:szCs w:val="19"/>
               </w:rPr>
-              <w:t>The browser shows “This site can’t be reached”</w:t>
+              <w:t>“</w:t>
+            </w:r>
+            <w:r>
+              <w:rPr>
+                <w:rFonts w:eastAsia="Times New Roman" w:cs="Times New Roman"/>
+                <w:b w:val="false"/>
+                <w:bCs w:val="false"/>
+                <w:color w:val="58595B"/>
+                <w:sz w:val="19"/>
+                <w:szCs w:val="19"/>
+              </w:rPr>
+              <w:t>npm is not recognized” / “command not found”</w:t>
             </w:r>
           </w:p>
         </w:tc>
@@ -6295,7 +6306,7 @@
                 <w:sz w:val="19"/>
                 <w:szCs w:val="19"/>
               </w:rPr>
-              <w:t>Check that both windows are still open and show no error. The address is http://localhost:5173.</w:t>
+              <w:t>Node.js is not installed or the window was opened before the installation. Install Node.js, then open a new window.</w:t>
             </w:r>
           </w:p>
         </w:tc>
@@ -6330,7 +6341,7 @@
                 <w:sz w:val="19"/>
                 <w:szCs w:val="19"/>
               </w:rPr>
-              <w:t>Sign-in says “Email or password is incorrect”</w:t>
+              <w:t>The browser shows “This site can’t be reached”</w:t>
             </w:r>
           </w:p>
         </w:tc>
@@ -6360,7 +6371,7 @@
                 <w:sz w:val="19"/>
                 <w:szCs w:val="19"/>
               </w:rPr>
-              <w:t>Check the password (it is case-sensitive). If you changed the data, run npm run seed to restore the demonstration accounts.</w:t>
+              <w:t>Check that both windows are still open and show no error. The address is http://localhost:5173.</w:t>
             </w:r>
           </w:p>
         </w:tc>
@@ -6395,6 +6406,71 @@
                 <w:sz w:val="19"/>
                 <w:szCs w:val="19"/>
               </w:rPr>
+              <w:t>Sign-in says “Email or password is incorrect”</w:t>
+            </w:r>
+          </w:p>
+        </w:tc>
+        <w:tc>
+          <w:tcPr>
+            <w:tcW w:w="6145" w:type="dxa"/>
+            <w:tcBorders>
+              <w:top w:val="single" w:sz="4" w:space="0" w:color="E3E3E4"/>
+              <w:left w:val="single" w:sz="4" w:space="0" w:color="E3E3E4"/>
+              <w:bottom w:val="single" w:sz="4" w:space="0" w:color="E3E3E4"/>
+              <w:right w:val="single" w:sz="4" w:space="0" w:color="E3E3E4"/>
+            </w:tcBorders>
+            <w:shd w:color="auto" w:fill="FFFFFF" w:val="clear"/>
+          </w:tcPr>
+          <w:p>
+            <w:pPr>
+              <w:pStyle w:val="Normal"/>
+              <w:spacing w:before="0" w:after="20"/>
+              <w:rPr/>
+            </w:pPr>
+            <w:r>
+              <w:rPr>
+                <w:rFonts w:eastAsia="Times New Roman" w:cs="Times New Roman"/>
+                <w:b w:val="false"/>
+                <w:bCs w:val="false"/>
+                <w:color w:val="58595B"/>
+                <w:sz w:val="19"/>
+                <w:szCs w:val="19"/>
+              </w:rPr>
+              <w:t>Check the password (it is case-sensitive). If you changed the data, run npm run seed to restore the demonstration accounts.</w:t>
+            </w:r>
+          </w:p>
+        </w:tc>
+      </w:tr>
+      <w:tr>
+        <w:trPr>
+          <w:cantSplit w:val="true"/>
+        </w:trPr>
+        <w:tc>
+          <w:tcPr>
+            <w:tcW w:w="3600" w:type="dxa"/>
+            <w:tcBorders>
+              <w:top w:val="single" w:sz="4" w:space="0" w:color="E3E3E4"/>
+              <w:left w:val="single" w:sz="4" w:space="0" w:color="E3E3E4"/>
+              <w:bottom w:val="single" w:sz="4" w:space="0" w:color="E3E3E4"/>
+              <w:right w:val="single" w:sz="4" w:space="0" w:color="E3E3E4"/>
+            </w:tcBorders>
+            <w:shd w:color="auto" w:fill="F2F2F3" w:val="clear"/>
+          </w:tcPr>
+          <w:p>
+            <w:pPr>
+              <w:pStyle w:val="Normal"/>
+              <w:spacing w:before="0" w:after="20"/>
+              <w:rPr/>
+            </w:pPr>
+            <w:r>
+              <w:rPr>
+                <w:rFonts w:eastAsia="Times New Roman" w:cs="Times New Roman"/>
+                <w:b w:val="false"/>
+                <w:bCs w:val="false"/>
+                <w:color w:val="58595B"/>
+                <w:sz w:val="19"/>
+                <w:szCs w:val="19"/>
+              </w:rPr>
               <w:t>“</w:t>
             </w:r>
             <w:r>
@@ -6419,7 +6495,7 @@
               <w:bottom w:val="single" w:sz="4" w:space="0" w:color="E3E3E4"/>
               <w:right w:val="single" w:sz="4" w:space="0" w:color="E3E3E4"/>
             </w:tcBorders>
-            <w:shd w:color="auto" w:fill="FFFFFF" w:val="clear"/>
+            <w:shd w:color="auto" w:fill="F2F2F3" w:val="clear"/>
           </w:tcPr>
           <w:p>
             <w:pPr>

</xml_diff>